<commit_message>
docs: update README.md and AuthX_Project_Documentation.docx with enterprise architecture & security features
- Updated README.md with premium styling, icons, badges, architecture diagrams, and security matrices
- Documented FIDO2 Passkeys, Authenticator App (TOTP), Cryptographic Recovery Kit, Emergency Lockdown Step-Up Auth, Device Detection, and Isolated Demo Mode
- Updated AuthX_Project_Documentation.docx to reflect full technical specs and security policies
</commit_message>
<xml_diff>
--- a/AuthX_Project_Documentation.docx
+++ b/AuthX_Project_Documentation.docx
@@ -4,29 +4,147 @@
   <w:body>
     <w:p>
       <w:pPr>
-        <w:spacing w:before="480" w:after="80"/>
+        <w:jc w:val="center"/>
       </w:pPr>
       <w:r>
         <w:rPr>
-          <w:rFonts w:ascii="Calibri" w:hAnsi="Calibri"/>
           <w:b/>
-          <w:color w:val="0F172A"/>
+          <w:color w:val="1A312C"/>
           <w:sz w:val="48"/>
         </w:rPr>
-        <w:t>AuthX — Next-Generation Passwordless Authentication Platform</w:t>
+        <w:t>AuthX — Platform Architecture &amp; Technical Documentation</w:t>
       </w:r>
     </w:p>
     <w:p>
       <w:pPr>
-        <w:spacing w:after="480"/>
+        <w:jc w:val="center"/>
       </w:pPr>
       <w:r>
         <w:rPr>
-          <w:rFonts w:ascii="Calibri" w:hAnsi="Calibri"/>
-          <w:color w:val="2563EB"/>
-          <w:sz w:val="26"/>
+          <w:color w:val="428475"/>
+          <w:sz w:val="24"/>
         </w:rPr>
-        <w:t>Comprehensive Technical Documentation, System Architecture, Code Analysis &amp; Data Flow Guide</w:t>
+        <w:t>Next-Gen Passwordless Authentication, Step-Up Security &amp; Isolation Platform</w:t>
+        <w:br/>
+        <w:t>Version 2.0 | August 2026</w:t>
+      </w:r>
+    </w:p>
+    <w:p>
+      <w:pPr>
+        <w:spacing w:after="240"/>
+      </w:pPr>
+    </w:p>
+    <w:p>
+      <w:pPr>
+        <w:pStyle w:val="Heading1"/>
+      </w:pPr>
+      <w:r>
+        <w:t>1. Executive Summary</w:t>
+      </w:r>
+    </w:p>
+    <w:p>
+      <w:r>
+        <w:t>AuthX is an enterprise-grade passwordless authentication platform designed to provide adaptive zero-trust security without compromising user experience. AuthX eliminates traditional password risks (phishing, credential stuffing, brute-force attacks) by implementing hardware-backed FIDO2 WebAuthn Passkeys, TOTP Authenticator App integration, Cross-Device QR Approvals, Cryptographic Recovery Kits, Persistent Device Detection, and an Emergency Lockdown Engine backed by short-lived server-verifiable Step-Up Authentication tokens.</w:t>
+      </w:r>
+    </w:p>
+    <w:p>
+      <w:pPr>
+        <w:pStyle w:val="Heading1"/>
+      </w:pPr>
+      <w:r>
+        <w:t>2. Core Security Capabilities</w:t>
+      </w:r>
+    </w:p>
+    <w:p>
+      <w:r>
+        <w:rPr>
+          <w:b/>
+          <w:color w:val="1A312C"/>
+        </w:rPr>
+        <w:t xml:space="preserve">🔑 WebAuthn / FIDO2 Passkeys: </w:t>
+      </w:r>
+      <w:r>
+        <w:t>Passwordless authentication leveraging Touch ID, Face ID, Windows Hello, and hardware security keys. Backed by origin-bound public key cryptography and automatic sign-counter anti-replay validation.</w:t>
+      </w:r>
+    </w:p>
+    <w:p>
+      <w:r>
+        <w:rPr>
+          <w:b/>
+          <w:color w:val="1A312C"/>
+        </w:rPr>
+        <w:t xml:space="preserve">📱 Authenticator App (TOTP): </w:t>
+      </w:r>
+      <w:r>
+        <w:t>Support for time-based one-time passwords (TOTP) via Google Authenticator, Authy, and Microsoft Authenticator. TOTP secrets are stored in AES-256 encrypted format using server-side master keys.</w:t>
+      </w:r>
+    </w:p>
+    <w:p>
+      <w:r>
+        <w:rPr>
+          <w:b/>
+          <w:color w:val="1A312C"/>
+        </w:rPr>
+        <w:t xml:space="preserve">🛡️ Cryptographic Recovery Kit: </w:t>
+      </w:r>
+      <w:r>
+        <w:t>Generates 12 unique, cryptographically secure 8-character backup recovery codes (e.g., 8F4K-92LM). Codes are stored as SHA-256 hashes in the database and enforced with atomic single-use tracking.</w:t>
+      </w:r>
+    </w:p>
+    <w:p>
+      <w:r>
+        <w:rPr>
+          <w:b/>
+          <w:color w:val="1A312C"/>
+        </w:rPr>
+        <w:t xml:space="preserve">🚨 Emergency Lockdown &amp; Step-Up Auth: </w:t>
+      </w:r>
+      <w:r>
+        <w:t>High-privilege security feature allowing users to immediately terminate all other active sessions across devices. Requires mandatory Step-Up Authentication before execution. Permitted step-up methods are strictly restricted to Authenticator App (TOTP), Passkey, or Recovery Code. Email OTP and QR authentication are explicitly rejected.</w:t>
+      </w:r>
+    </w:p>
+    <w:p>
+      <w:r>
+        <w:rPr>
+          <w:b/>
+          <w:color w:val="1A312C"/>
+        </w:rPr>
+        <w:t xml:space="preserve">🖥️ Persistent Device Detection &amp; Untrusted Alerts: </w:t>
+      </w:r>
+      <w:r>
+        <w:t>Uses client hints and persistent instance ID fingerprinting to track devices. Automatically alerts users via dashboard popups and non-blocking security emails when a login from an untrusted device is detected.</w:t>
+      </w:r>
+    </w:p>
+    <w:p>
+      <w:r>
+        <w:rPr>
+          <w:b/>
+          <w:color w:val="1A312C"/>
+        </w:rPr>
+        <w:t xml:space="preserve">📲 Cross-Device QR Code Approval: </w:t>
+      </w:r>
+      <w:r>
+        <w:t>Allows desktop logins by scanning a 60-second expiring QR code using an authenticated mobile device.</w:t>
+      </w:r>
+    </w:p>
+    <w:p>
+      <w:r>
+        <w:rPr>
+          <w:b/>
+          <w:color w:val="1A312C"/>
+        </w:rPr>
+        <w:t xml:space="preserve">🧪 Isolated Product Demo Mode: </w:t>
+      </w:r>
+      <w:r>
+        <w:t>Completely isolated product showcase running 100% on client-side state. Utilizes Web Crypto API for OTP generation and displays toast verification notices without touching database records or real authentication endpoints.</w:t>
+      </w:r>
+    </w:p>
+    <w:p>
+      <w:pPr>
+        <w:pStyle w:val="Heading1"/>
+      </w:pPr>
+      <w:r>
+        <w:t>3. Security Matrix — Emergency Lockdown Step-Up Authorization</w:t>
       </w:r>
     </w:p>
     <w:tbl>
@@ -36,51 +154,53 @@
         <w:tblLook w:firstColumn="1" w:firstRow="1" w:lastColumn="0" w:lastRow="0" w:noHBand="0" w:noVBand="1" w:val="04A0"/>
       </w:tblPr>
       <w:tblGrid>
-        <w:gridCol w:w="4680"/>
-        <w:gridCol w:w="4680"/>
+        <w:gridCol w:w="3120"/>
+        <w:gridCol w:w="3120"/>
+        <w:gridCol w:w="3120"/>
       </w:tblGrid>
       <w:tr>
         <w:tc>
           <w:tcPr>
-            <w:tcW w:type="dxa" w:w="4680"/>
-            <w:shd w:fill="F1F5F9"/>
-            <w:tcMar>
-              <w:top w:w="80" w:type="dxa"/>
-              <w:bottom w:w="80" w:type="dxa"/>
-              <w:left w:w="120" w:type="dxa"/>
-              <w:right w:w="120" w:type="dxa"/>
-            </w:tcMar>
+            <w:tcW w:type="dxa" w:w="3120"/>
+            <w:shd w:val="clear" w:color="auto" w:fill="1A312C"/>
           </w:tcPr>
           <w:p>
             <w:r>
               <w:rPr>
-                <w:rFonts w:ascii="Calibri" w:hAnsi="Calibri"/>
-                <w:color w:val="475569"/>
-                <w:sz w:val="19"/>
+                <w:b/>
+                <w:color w:val="FFFFFF"/>
               </w:rPr>
-              <w:t>Project: AuthX Platform</w:t>
+              <w:t>Authentication Method</w:t>
             </w:r>
           </w:p>
         </w:tc>
         <w:tc>
           <w:tcPr>
-            <w:tcW w:type="dxa" w:w="4680"/>
-            <w:shd w:fill="F1F5F9"/>
-            <w:tcMar>
-              <w:top w:w="80" w:type="dxa"/>
-              <w:bottom w:w="80" w:type="dxa"/>
-              <w:left w:w="120" w:type="dxa"/>
-              <w:right w:w="120" w:type="dxa"/>
-            </w:tcMar>
+            <w:tcW w:type="dxa" w:w="3120"/>
+            <w:shd w:val="clear" w:color="auto" w:fill="1A312C"/>
           </w:tcPr>
           <w:p>
             <w:r>
               <w:rPr>
-                <w:rFonts w:ascii="Calibri" w:hAnsi="Calibri"/>
-                <w:color w:val="475569"/>
-                <w:sz w:val="19"/>
+                <w:b/>
+                <w:color w:val="FFFFFF"/>
               </w:rPr>
-              <w:t>Author: Engineering &amp; Security Team</w:t>
+              <w:t>Lockdown Step-Up Allowed?</w:t>
+            </w:r>
+          </w:p>
+        </w:tc>
+        <w:tc>
+          <w:tcPr>
+            <w:tcW w:type="dxa" w:w="3120"/>
+            <w:shd w:val="clear" w:color="auto" w:fill="1A312C"/>
+          </w:tcPr>
+          <w:p>
+            <w:r>
+              <w:rPr>
+                <w:b/>
+                <w:color w:val="FFFFFF"/>
+              </w:rPr>
+              <w:t>Verification Mechanism &amp; Security Controls</w:t>
             </w:r>
           </w:p>
         </w:tc>
@@ -88,45 +208,197 @@
       <w:tr>
         <w:tc>
           <w:tcPr>
-            <w:tcW w:type="dxa" w:w="4680"/>
-            <w:shd w:fill="F1F5F9"/>
-            <w:tcMar>
-              <w:top w:w="80" w:type="dxa"/>
-              <w:bottom w:w="80" w:type="dxa"/>
-              <w:left w:w="120" w:type="dxa"/>
-              <w:right w:w="120" w:type="dxa"/>
-            </w:tcMar>
+            <w:tcW w:type="dxa" w:w="3120"/>
           </w:tcPr>
           <w:p>
             <w:r>
-              <w:rPr>
-                <w:rFonts w:ascii="Calibri" w:hAnsi="Calibri"/>
-                <w:color w:val="475569"/>
-                <w:sz w:val="19"/>
-              </w:rPr>
-              <w:t>Version: v2.4 (Production Architecture)</w:t>
+              <w:t>Authenticator App (TOTP)</w:t>
             </w:r>
           </w:p>
         </w:tc>
         <w:tc>
           <w:tcPr>
-            <w:tcW w:type="dxa" w:w="4680"/>
-            <w:shd w:fill="F1F5F9"/>
-            <w:tcMar>
-              <w:top w:w="80" w:type="dxa"/>
-              <w:bottom w:w="80" w:type="dxa"/>
-              <w:left w:w="120" w:type="dxa"/>
-              <w:right w:w="120" w:type="dxa"/>
-            </w:tcMar>
+            <w:tcW w:type="dxa" w:w="3120"/>
+            <w:shd w:val="clear" w:color="auto" w:fill="E6F4EA"/>
           </w:tcPr>
           <w:p>
             <w:r>
-              <w:rPr>
-                <w:rFonts w:ascii="Calibri" w:hAnsi="Calibri"/>
-                <w:color w:val="475569"/>
-                <w:sz w:val="19"/>
-              </w:rPr>
-              <w:t>Date: August 2026</w:t>
+              <w:t>ALLOWED (Recommended)</w:t>
+            </w:r>
+          </w:p>
+        </w:tc>
+        <w:tc>
+          <w:tcPr>
+            <w:tcW w:type="dxa" w:w="3120"/>
+          </w:tcPr>
+          <w:p>
+            <w:r>
+              <w:t>6-digit code checked against AES-256 decrypted user secret. Issues 5-min step-up token.</w:t>
+            </w:r>
+          </w:p>
+        </w:tc>
+      </w:tr>
+      <w:tr>
+        <w:tc>
+          <w:tcPr>
+            <w:tcW w:type="dxa" w:w="3120"/>
+          </w:tcPr>
+          <w:p>
+            <w:r>
+              <w:t>Passkey (WebAuthn)</w:t>
+            </w:r>
+          </w:p>
+        </w:tc>
+        <w:tc>
+          <w:tcPr>
+            <w:tcW w:type="dxa" w:w="3120"/>
+            <w:shd w:val="clear" w:color="auto" w:fill="E6F4EA"/>
+          </w:tcPr>
+          <w:p>
+            <w:r>
+              <w:t>ALLOWED</w:t>
+            </w:r>
+          </w:p>
+        </w:tc>
+        <w:tc>
+          <w:tcPr>
+            <w:tcW w:type="dxa" w:w="3120"/>
+          </w:tcPr>
+          <w:p>
+            <w:r>
+              <w:t>Fresh WebAuthn challenge/response assertion ceremony. Counter updated for replay protection.</w:t>
+            </w:r>
+          </w:p>
+        </w:tc>
+      </w:tr>
+      <w:tr>
+        <w:tc>
+          <w:tcPr>
+            <w:tcW w:type="dxa" w:w="3120"/>
+          </w:tcPr>
+          <w:p>
+            <w:r>
+              <w:t>Recovery Code</w:t>
+            </w:r>
+          </w:p>
+        </w:tc>
+        <w:tc>
+          <w:tcPr>
+            <w:tcW w:type="dxa" w:w="3120"/>
+            <w:shd w:val="clear" w:color="auto" w:fill="E6F4EA"/>
+          </w:tcPr>
+          <w:p>
+            <w:r>
+              <w:t>ALLOWED</w:t>
+            </w:r>
+          </w:p>
+        </w:tc>
+        <w:tc>
+          <w:tcPr>
+            <w:tcW w:type="dxa" w:w="3120"/>
+          </w:tcPr>
+          <w:p>
+            <w:r>
+              <w:t>SHA-256 hash match against unused codes. Atomic single-use mark prevents reuse.</w:t>
+            </w:r>
+          </w:p>
+        </w:tc>
+      </w:tr>
+      <w:tr>
+        <w:tc>
+          <w:tcPr>
+            <w:tcW w:type="dxa" w:w="3120"/>
+          </w:tcPr>
+          <w:p>
+            <w:r>
+              <w:t>Email OTP</w:t>
+            </w:r>
+          </w:p>
+        </w:tc>
+        <w:tc>
+          <w:tcPr>
+            <w:tcW w:type="dxa" w:w="3120"/>
+            <w:shd w:val="clear" w:color="auto" w:fill="FCE8E6"/>
+          </w:tcPr>
+          <w:p>
+            <w:r>
+              <w:t>REJECTED</w:t>
+            </w:r>
+          </w:p>
+        </w:tc>
+        <w:tc>
+          <w:tcPr>
+            <w:tcW w:type="dxa" w:w="3120"/>
+          </w:tcPr>
+          <w:p>
+            <w:r>
+              <w:t>Strictly blocked at server API layer (401 STEPUP_REQUIRED). Cannot authorize lockdown.</w:t>
+            </w:r>
+          </w:p>
+        </w:tc>
+      </w:tr>
+      <w:tr>
+        <w:tc>
+          <w:tcPr>
+            <w:tcW w:type="dxa" w:w="3120"/>
+          </w:tcPr>
+          <w:p>
+            <w:r>
+              <w:t>QR Code Login</w:t>
+            </w:r>
+          </w:p>
+        </w:tc>
+        <w:tc>
+          <w:tcPr>
+            <w:tcW w:type="dxa" w:w="3120"/>
+            <w:shd w:val="clear" w:color="auto" w:fill="FCE8E6"/>
+          </w:tcPr>
+          <w:p>
+            <w:r>
+              <w:t>REJECTED</w:t>
+            </w:r>
+          </w:p>
+        </w:tc>
+        <w:tc>
+          <w:tcPr>
+            <w:tcW w:type="dxa" w:w="3120"/>
+          </w:tcPr>
+          <w:p>
+            <w:r>
+              <w:t>Strictly blocked at server API layer. Cannot authorize lockdown.</w:t>
+            </w:r>
+          </w:p>
+        </w:tc>
+      </w:tr>
+      <w:tr>
+        <w:tc>
+          <w:tcPr>
+            <w:tcW w:type="dxa" w:w="3120"/>
+          </w:tcPr>
+          <w:p>
+            <w:r>
+              <w:t>Session Token Alone</w:t>
+            </w:r>
+          </w:p>
+        </w:tc>
+        <w:tc>
+          <w:tcPr>
+            <w:tcW w:type="dxa" w:w="3120"/>
+            <w:shd w:val="clear" w:color="auto" w:fill="FCE8E6"/>
+          </w:tcPr>
+          <w:p>
+            <w:r>
+              <w:t>REJECTED</w:t>
+            </w:r>
+          </w:p>
+        </w:tc>
+        <w:tc>
+          <w:tcPr>
+            <w:tcW w:type="dxa" w:w="3120"/>
+          </w:tcPr>
+          <w:p>
+            <w:r>
+              <w:t>Requires explicit step-up token verification. Session alone cannot execute lockdown.</w:t>
             </w:r>
           </w:p>
         </w:tc>
@@ -134,3332 +406,24 @@
     </w:tbl>
     <w:p>
       <w:pPr>
-        <w:spacing w:after="240"/>
-      </w:pPr>
-    </w:p>
-    <w:p>
-      <w:pPr>
-        <w:keepNext/>
-        <w:spacing w:before="360" w:after="160"/>
+        <w:pStyle w:val="Heading1"/>
       </w:pPr>
       <w:r>
-        <w:rPr>
-          <w:rFonts w:ascii="Calibri" w:hAnsi="Calibri"/>
-          <w:b/>
-          <w:color w:val="0F172A"/>
-          <w:sz w:val="36"/>
-        </w:rPr>
-        <w:t>1. Executive Summary &amp; Project Architecture</w:t>
+        <w:t>4. Technology Stack &amp; Directory Structure</w:t>
       </w:r>
     </w:p>
     <w:p>
-      <w:pPr>
-        <w:spacing w:before="0" w:after="120" w:line="276" w:lineRule="auto"/>
-      </w:pPr>
       <w:r>
-        <w:rPr>
-          <w:rFonts w:ascii="Calibri" w:hAnsi="Calibri"/>
-          <w:b/>
-          <w:color w:val="1E293B"/>
-          <w:sz w:val="22"/>
-        </w:rPr>
-        <w:t xml:space="preserve">Core Concept: </w:t>
+        <w:t>• Core Framework: Next.js 16 (App Router, Turbopack), React 19, TypeScript 5</w:t>
+        <w:br/>
+        <w:t>• Cryptography &amp; Auth: WebAuthn (@simplewebauthn), HMAC-SHA1 TOTP, Web Crypto API</w:t>
+        <w:br/>
+        <w:t>• Database &amp; Storage: Prisma ORM, SQLite / PostgreSQL, Ephemeral In-Memory Step-Up Store</w:t>
+        <w:br/>
+        <w:t>• UI &amp; Styling: Tailwind CSS 4, Framer Motion, Lucide Icons, Recharts</w:t>
+        <w:br/>
+        <w:t>• Notifications: Resend Email Notification API</w:t>
       </w:r>
-      <w:r>
-        <w:rPr>
-          <w:rFonts w:ascii="Calibri" w:hAnsi="Calibri"/>
-          <w:color w:val="334155"/>
-          <w:sz w:val="22"/>
-        </w:rPr>
-        <w:t>AuthX is an enterprise-grade, passwordless authentication and security management web application. Built with modern web standards, AuthX eliminates password-based vulnerabilities such as credential stuffing, phishing, and password reuse. The platform integrates hardware-bound WebAuthn passkeys, single-use email OTPs via Resend API, cross-device QR code approval, adaptive risk scoring, physical device fingerprinting, and a strictly isolated Demo Mode.</w:t>
-      </w:r>
-    </w:p>
-    <w:tbl>
-      <w:tblPr>
-        <w:tblW w:type="auto" w:w="0"/>
-        <w:jc w:val="center"/>
-        <w:tblLook w:firstColumn="1" w:firstRow="1" w:lastColumn="0" w:lastRow="0" w:noHBand="0" w:noVBand="1" w:val="04A0"/>
-      </w:tblPr>
-      <w:tblGrid>
-        <w:gridCol w:w="9360"/>
-      </w:tblGrid>
-      <w:tr>
-        <w:tc>
-          <w:tcPr>
-            <w:tcW w:type="dxa" w:w="9360"/>
-            <w:shd w:fill="F1F5F9"/>
-            <w:tcMar>
-              <w:top w:w="140" w:type="dxa"/>
-              <w:bottom w:w="140" w:type="dxa"/>
-              <w:left w:w="200" w:type="dxa"/>
-              <w:right w:w="200" w:type="dxa"/>
-            </w:tcMar>
-            <w:tcBorders>
-              <w:top w:val="none"/>
-              <w:left w:val="single" w:sz="36" w:space="0" w:color="2563EB"/>
-              <w:bottom w:val="none"/>
-              <w:right w:val="none"/>
-            </w:tcBorders>
-          </w:tcPr>
-          <w:p>
-            <w:pPr>
-              <w:spacing w:before="0" w:after="40"/>
-            </w:pPr>
-            <w:r>
-              <w:rPr>
-                <w:rFonts w:ascii="Calibri" w:hAnsi="Calibri"/>
-                <w:b/>
-                <w:color w:val="2563EB"/>
-                <w:sz w:val="22"/>
-              </w:rPr>
-              <w:t>💡 Key Architectural Objective</w:t>
-              <w:br/>
-            </w:r>
-            <w:r>
-              <w:rPr>
-                <w:rFonts w:ascii="Calibri" w:hAnsi="Calibri"/>
-                <w:color w:val="475569"/>
-                <w:sz w:val="20"/>
-              </w:rPr>
-              <w:t>To deliver maximum security with seamless user experience. AuthX achieves zero password reliance while providing real-time session tracking, instant device revocation, adaptive risk engine evaluation, and comprehensive audit logs.</w:t>
-            </w:r>
-          </w:p>
-        </w:tc>
-      </w:tr>
-    </w:tbl>
-    <w:p>
-      <w:pPr>
-        <w:spacing w:after="80"/>
-      </w:pPr>
-    </w:p>
-    <w:p>
-      <w:pPr>
-        <w:keepNext/>
-        <w:spacing w:before="280" w:after="120"/>
-      </w:pPr>
-      <w:r>
-        <w:rPr>
-          <w:rFonts w:ascii="Calibri" w:hAnsi="Calibri"/>
-          <w:b/>
-          <w:color w:val="2563EB"/>
-          <w:sz w:val="28"/>
-        </w:rPr>
-        <w:t>1.1 Technology Stack</w:t>
-      </w:r>
-    </w:p>
-    <w:p>
-      <w:pPr>
-        <w:pStyle w:val="ListBullet"/>
-        <w:spacing w:before="0" w:after="80" w:line="276" w:lineRule="auto"/>
-      </w:pPr>
-      <w:r>
-        <w:rPr>
-          <w:rFonts w:ascii="Calibri" w:hAnsi="Calibri"/>
-          <w:b/>
-          <w:color w:val="0F172A"/>
-          <w:sz w:val="21"/>
-        </w:rPr>
-        <w:t xml:space="preserve">Frontend &amp; API Framework: </w:t>
-      </w:r>
-      <w:r>
-        <w:rPr>
-          <w:rFonts w:ascii="Calibri" w:hAnsi="Calibri"/>
-          <w:color w:val="334155"/>
-          <w:sz w:val="21"/>
-        </w:rPr>
-        <w:t>Next.js 16 (App Router) with Turbopack for server-side rendering, static site generation, and edge-ready API routes.</w:t>
-      </w:r>
-    </w:p>
-    <w:p>
-      <w:pPr>
-        <w:pStyle w:val="ListBullet"/>
-        <w:spacing w:before="0" w:after="80" w:line="276" w:lineRule="auto"/>
-      </w:pPr>
-      <w:r>
-        <w:rPr>
-          <w:rFonts w:ascii="Calibri" w:hAnsi="Calibri"/>
-          <w:b/>
-          <w:color w:val="0F172A"/>
-          <w:sz w:val="21"/>
-        </w:rPr>
-        <w:t xml:space="preserve">Language: </w:t>
-      </w:r>
-      <w:r>
-        <w:rPr>
-          <w:rFonts w:ascii="Calibri" w:hAnsi="Calibri"/>
-          <w:color w:val="334155"/>
-          <w:sz w:val="21"/>
-        </w:rPr>
-        <w:t>TypeScript 5.x ensuring strict type safety across database entities, API contracts, and UI component props.</w:t>
-      </w:r>
-    </w:p>
-    <w:p>
-      <w:pPr>
-        <w:pStyle w:val="ListBullet"/>
-        <w:spacing w:before="0" w:after="80" w:line="276" w:lineRule="auto"/>
-      </w:pPr>
-      <w:r>
-        <w:rPr>
-          <w:rFonts w:ascii="Calibri" w:hAnsi="Calibri"/>
-          <w:b/>
-          <w:color w:val="0F172A"/>
-          <w:sz w:val="21"/>
-        </w:rPr>
-        <w:t xml:space="preserve">Styling &amp; UI System: </w:t>
-      </w:r>
-      <w:r>
-        <w:rPr>
-          <w:rFonts w:ascii="Calibri" w:hAnsi="Calibri"/>
-          <w:color w:val="334155"/>
-          <w:sz w:val="21"/>
-        </w:rPr>
-        <w:t>Vanilla CSS design system, Tailwind CSS utilities, Shadcn UI primitives, and Framer Motion micro-animations.</w:t>
-      </w:r>
-    </w:p>
-    <w:p>
-      <w:pPr>
-        <w:pStyle w:val="ListBullet"/>
-        <w:spacing w:before="0" w:after="80" w:line="276" w:lineRule="auto"/>
-      </w:pPr>
-      <w:r>
-        <w:rPr>
-          <w:rFonts w:ascii="Calibri" w:hAnsi="Calibri"/>
-          <w:b/>
-          <w:color w:val="0F172A"/>
-          <w:sz w:val="21"/>
-        </w:rPr>
-        <w:t xml:space="preserve">Database &amp; ORM: </w:t>
-      </w:r>
-      <w:r>
-        <w:rPr>
-          <w:rFonts w:ascii="Calibri" w:hAnsi="Calibri"/>
-          <w:color w:val="334155"/>
-          <w:sz w:val="21"/>
-        </w:rPr>
-        <w:t>Prisma ORM with SQLite database engine (custom.db) for reliable, local-first data persistence.</w:t>
-      </w:r>
-    </w:p>
-    <w:p>
-      <w:pPr>
-        <w:pStyle w:val="ListBullet"/>
-        <w:spacing w:before="0" w:after="80" w:line="276" w:lineRule="auto"/>
-      </w:pPr>
-      <w:r>
-        <w:rPr>
-          <w:rFonts w:ascii="Calibri" w:hAnsi="Calibri"/>
-          <w:b/>
-          <w:color w:val="0F172A"/>
-          <w:sz w:val="21"/>
-        </w:rPr>
-        <w:t xml:space="preserve">Hardware Passkeys: </w:t>
-      </w:r>
-      <w:r>
-        <w:rPr>
-          <w:rFonts w:ascii="Calibri" w:hAnsi="Calibri"/>
-          <w:color w:val="334155"/>
-          <w:sz w:val="21"/>
-        </w:rPr>
-        <w:t>SimpleWebAuthn (@simplewebauthn/browser &amp; @simplewebauthn/server) for FIDO2 WebAuthn ceremony execution.</w:t>
-      </w:r>
-    </w:p>
-    <w:p>
-      <w:pPr>
-        <w:pStyle w:val="ListBullet"/>
-        <w:spacing w:before="0" w:after="80" w:line="276" w:lineRule="auto"/>
-      </w:pPr>
-      <w:r>
-        <w:rPr>
-          <w:rFonts w:ascii="Calibri" w:hAnsi="Calibri"/>
-          <w:b/>
-          <w:color w:val="0F172A"/>
-          <w:sz w:val="21"/>
-        </w:rPr>
-        <w:t xml:space="preserve">Email Delivery: </w:t>
-      </w:r>
-      <w:r>
-        <w:rPr>
-          <w:rFonts w:ascii="Calibri" w:hAnsi="Calibri"/>
-          <w:color w:val="334155"/>
-          <w:sz w:val="21"/>
-        </w:rPr>
-        <w:t>Resend API integration for delivery of single-use 6-digit verification codes.</w:t>
-      </w:r>
-    </w:p>
-    <w:p>
-      <w:pPr>
-        <w:pStyle w:val="ListBullet"/>
-        <w:spacing w:before="0" w:after="80" w:line="276" w:lineRule="auto"/>
-      </w:pPr>
-      <w:r>
-        <w:rPr>
-          <w:rFonts w:ascii="Calibri" w:hAnsi="Calibri"/>
-          <w:b/>
-          <w:color w:val="0F172A"/>
-          <w:sz w:val="21"/>
-        </w:rPr>
-        <w:t xml:space="preserve">Data Visualization: </w:t>
-      </w:r>
-      <w:r>
-        <w:rPr>
-          <w:rFonts w:ascii="Calibri" w:hAnsi="Calibri"/>
-          <w:color w:val="334155"/>
-          <w:sz w:val="21"/>
-        </w:rPr>
-        <w:t>Recharts for interactive security analytics visualizations (Pie chart, Bar chart, Trend chart).</w:t>
-      </w:r>
-    </w:p>
-    <w:p>
-      <w:pPr>
-        <w:keepNext/>
-        <w:spacing w:before="360" w:after="160"/>
-      </w:pPr>
-      <w:r>
-        <w:rPr>
-          <w:rFonts w:ascii="Calibri" w:hAnsi="Calibri"/>
-          <w:b/>
-          <w:color w:val="0F172A"/>
-          <w:sz w:val="36"/>
-        </w:rPr>
-        <w:t>2. Core Feature Specifications &amp; Code Explanation</w:t>
-      </w:r>
-    </w:p>
-    <w:p>
-      <w:pPr>
-        <w:keepNext/>
-        <w:spacing w:before="280" w:after="120"/>
-      </w:pPr>
-      <w:r>
-        <w:rPr>
-          <w:rFonts w:ascii="Calibri" w:hAnsi="Calibri"/>
-          <w:b/>
-          <w:color w:val="2563EB"/>
-          <w:sz w:val="28"/>
-        </w:rPr>
-        <w:t>2.1 Email OTP Authentication (Real Mode)</w:t>
-      </w:r>
-    </w:p>
-    <w:p>
-      <w:pPr>
-        <w:spacing w:before="0" w:after="120" w:line="276" w:lineRule="auto"/>
-      </w:pPr>
-      <w:r>
-        <w:rPr>
-          <w:rFonts w:ascii="Calibri" w:hAnsi="Calibri"/>
-          <w:b/>
-          <w:color w:val="1E293B"/>
-          <w:sz w:val="22"/>
-        </w:rPr>
-        <w:t xml:space="preserve">Overview: </w:t>
-      </w:r>
-      <w:r>
-        <w:rPr>
-          <w:rFonts w:ascii="Calibri" w:hAnsi="Calibri"/>
-          <w:color w:val="334155"/>
-          <w:sz w:val="22"/>
-        </w:rPr>
-        <w:t>The Email OTP mechanism provides a friction-free login and sign-up method using cryptographically hashed single-use 6-digit verification codes.</w:t>
-      </w:r>
-    </w:p>
-    <w:p>
-      <w:pPr>
-        <w:pStyle w:val="ListBullet"/>
-        <w:spacing w:before="0" w:after="80" w:line="276" w:lineRule="auto"/>
-      </w:pPr>
-      <w:r>
-        <w:rPr>
-          <w:rFonts w:ascii="Calibri" w:hAnsi="Calibri"/>
-          <w:b/>
-          <w:color w:val="0F172A"/>
-          <w:sz w:val="21"/>
-        </w:rPr>
-        <w:t xml:space="preserve">Generation Route (/api/auth/otp/generate): </w:t>
-      </w:r>
-      <w:r>
-        <w:rPr>
-          <w:rFonts w:ascii="Calibri" w:hAnsi="Calibri"/>
-          <w:color w:val="334155"/>
-          <w:sz w:val="21"/>
-        </w:rPr>
-        <w:t>Generates a 6-digit random code, hashes it using SHA-256 with a salt, and stores it in the OTPCode model with a 5-minute TTL.</w:t>
-      </w:r>
-    </w:p>
-    <w:p>
-      <w:pPr>
-        <w:pStyle w:val="ListBullet"/>
-        <w:spacing w:before="0" w:after="80" w:line="276" w:lineRule="auto"/>
-      </w:pPr>
-      <w:r>
-        <w:rPr>
-          <w:rFonts w:ascii="Calibri" w:hAnsi="Calibri"/>
-          <w:b/>
-          <w:color w:val="0F172A"/>
-          <w:sz w:val="21"/>
-        </w:rPr>
-        <w:t xml:space="preserve">Verification Route (/api/auth/otp/verify): </w:t>
-      </w:r>
-      <w:r>
-        <w:rPr>
-          <w:rFonts w:ascii="Calibri" w:hAnsi="Calibri"/>
-          <w:color w:val="334155"/>
-          <w:sz w:val="21"/>
-        </w:rPr>
-        <w:t>Enforces rate-limiting (10 attempts/min per email, 20 attempts/min per IP) and a maximum of 3 attempts per code.</w:t>
-      </w:r>
-    </w:p>
-    <w:p>
-      <w:pPr>
-        <w:pStyle w:val="ListBullet"/>
-        <w:spacing w:before="0" w:after="80" w:line="276" w:lineRule="auto"/>
-      </w:pPr>
-      <w:r>
-        <w:rPr>
-          <w:rFonts w:ascii="Calibri" w:hAnsi="Calibri"/>
-          <w:b/>
-          <w:color w:val="0F172A"/>
-          <w:sz w:val="21"/>
-        </w:rPr>
-        <w:t xml:space="preserve">Email Delivery: </w:t>
-      </w:r>
-      <w:r>
-        <w:rPr>
-          <w:rFonts w:ascii="Calibri" w:hAnsi="Calibri"/>
-          <w:color w:val="334155"/>
-          <w:sz w:val="21"/>
-        </w:rPr>
-        <w:t>Sends real HTML email containing the 6-digit verification code using Resend API.</w:t>
-      </w:r>
-    </w:p>
-    <w:p>
-      <w:pPr>
-        <w:pStyle w:val="ListBullet"/>
-        <w:spacing w:before="0" w:after="80" w:line="276" w:lineRule="auto"/>
-      </w:pPr>
-      <w:r>
-        <w:rPr>
-          <w:rFonts w:ascii="Calibri" w:hAnsi="Calibri"/>
-          <w:b/>
-          <w:color w:val="0F172A"/>
-          <w:sz w:val="21"/>
-        </w:rPr>
-        <w:t xml:space="preserve">Session Minting: </w:t>
-      </w:r>
-      <w:r>
-        <w:rPr>
-          <w:rFonts w:ascii="Calibri" w:hAnsi="Calibri"/>
-          <w:color w:val="334155"/>
-          <w:sz w:val="21"/>
-        </w:rPr>
-        <w:t>On success, resolves or creates the canonical User record, records device details in TrustedDevice, logs a LoginHistory audit entry, and mints an active Session.</w:t>
-      </w:r>
-    </w:p>
-    <w:p>
-      <w:pPr>
-        <w:keepNext/>
-        <w:spacing w:before="280" w:after="120"/>
-      </w:pPr>
-      <w:r>
-        <w:rPr>
-          <w:rFonts w:ascii="Calibri" w:hAnsi="Calibri"/>
-          <w:b/>
-          <w:color w:val="2563EB"/>
-          <w:sz w:val="28"/>
-        </w:rPr>
-        <w:t>2.2 WebAuthn Passkeys (FIDO2 Passwordless)</w:t>
-      </w:r>
-    </w:p>
-    <w:p>
-      <w:pPr>
-        <w:spacing w:before="0" w:after="120" w:line="276" w:lineRule="auto"/>
-      </w:pPr>
-      <w:r>
-        <w:rPr>
-          <w:rFonts w:ascii="Calibri" w:hAnsi="Calibri"/>
-          <w:b/>
-          <w:color w:val="1E293B"/>
-          <w:sz w:val="22"/>
-        </w:rPr>
-        <w:t xml:space="preserve">Overview: </w:t>
-      </w:r>
-      <w:r>
-        <w:rPr>
-          <w:rFonts w:ascii="Calibri" w:hAnsi="Calibri"/>
-          <w:color w:val="334155"/>
-          <w:sz w:val="22"/>
-        </w:rPr>
-        <w:t>Passkeys utilize hardware-backed public-key cryptography (Touch ID, Face ID, YubiKey, Windows Hello) to achieve phishing-proof authentication.</w:t>
-      </w:r>
-    </w:p>
-    <w:p>
-      <w:pPr>
-        <w:pStyle w:val="ListBullet"/>
-        <w:spacing w:before="0" w:after="80" w:line="276" w:lineRule="auto"/>
-      </w:pPr>
-      <w:r>
-        <w:rPr>
-          <w:rFonts w:ascii="Calibri" w:hAnsi="Calibri"/>
-          <w:b/>
-          <w:color w:val="0F172A"/>
-          <w:sz w:val="21"/>
-        </w:rPr>
-        <w:t xml:space="preserve">Registration Challenge (/api/auth/passkey/register): </w:t>
-      </w:r>
-      <w:r>
-        <w:rPr>
-          <w:rFonts w:ascii="Calibri" w:hAnsi="Calibri"/>
-          <w:color w:val="334155"/>
-          <w:sz w:val="21"/>
-        </w:rPr>
-        <w:t>Generates a cryptographically random challenge and WebAuthn registration options.</w:t>
-      </w:r>
-    </w:p>
-    <w:p>
-      <w:pPr>
-        <w:pStyle w:val="ListBullet"/>
-        <w:spacing w:before="0" w:after="80" w:line="276" w:lineRule="auto"/>
-      </w:pPr>
-      <w:r>
-        <w:rPr>
-          <w:rFonts w:ascii="Calibri" w:hAnsi="Calibri"/>
-          <w:b/>
-          <w:color w:val="0F172A"/>
-          <w:sz w:val="21"/>
-        </w:rPr>
-        <w:t xml:space="preserve">Verification (/api/auth/passkey/verify): </w:t>
-      </w:r>
-      <w:r>
-        <w:rPr>
-          <w:rFonts w:ascii="Calibri" w:hAnsi="Calibri"/>
-          <w:color w:val="334155"/>
-          <w:sz w:val="21"/>
-        </w:rPr>
-        <w:t>Verifies client attestation response, extracts public key &amp; credential ID, and stores it in PasskeyCredential table.</w:t>
-      </w:r>
-    </w:p>
-    <w:p>
-      <w:pPr>
-        <w:pStyle w:val="ListBullet"/>
-        <w:spacing w:before="0" w:after="80" w:line="276" w:lineRule="auto"/>
-      </w:pPr>
-      <w:r>
-        <w:rPr>
-          <w:rFonts w:ascii="Calibri" w:hAnsi="Calibri"/>
-          <w:b/>
-          <w:color w:val="0F172A"/>
-          <w:sz w:val="21"/>
-        </w:rPr>
-        <w:t xml:space="preserve">Authentication (/api/auth/passkey/authenticate): </w:t>
-      </w:r>
-      <w:r>
-        <w:rPr>
-          <w:rFonts w:ascii="Calibri" w:hAnsi="Calibri"/>
-          <w:color w:val="334155"/>
-          <w:sz w:val="21"/>
-        </w:rPr>
-        <w:t>Issues WebAuthn assertion challenge to verify device ownership.</w:t>
-      </w:r>
-    </w:p>
-    <w:p>
-      <w:pPr>
-        <w:pStyle w:val="ListBullet"/>
-        <w:spacing w:before="0" w:after="80" w:line="276" w:lineRule="auto"/>
-      </w:pPr>
-      <w:r>
-        <w:rPr>
-          <w:rFonts w:ascii="Calibri" w:hAnsi="Calibri"/>
-          <w:b/>
-          <w:color w:val="0F172A"/>
-          <w:sz w:val="21"/>
-        </w:rPr>
-        <w:t xml:space="preserve">Assertion Verification (/api/auth/passkey/auth-verify): </w:t>
-      </w:r>
-      <w:r>
-        <w:rPr>
-          <w:rFonts w:ascii="Calibri" w:hAnsi="Calibri"/>
-          <w:color w:val="334155"/>
-          <w:sz w:val="21"/>
-        </w:rPr>
-        <w:t>Verifies signature against public key, verifies signature counter for replay protection, and creates an authenticated Session.</w:t>
-      </w:r>
-    </w:p>
-    <w:p>
-      <w:pPr>
-        <w:keepNext/>
-        <w:spacing w:before="280" w:after="120"/>
-      </w:pPr>
-      <w:r>
-        <w:rPr>
-          <w:rFonts w:ascii="Calibri" w:hAnsi="Calibri"/>
-          <w:b/>
-          <w:color w:val="2563EB"/>
-          <w:sz w:val="28"/>
-        </w:rPr>
-        <w:t>2.3 Cross-Device QR Code Authentication</w:t>
-      </w:r>
-    </w:p>
-    <w:p>
-      <w:pPr>
-        <w:spacing w:before="0" w:after="120" w:line="276" w:lineRule="auto"/>
-      </w:pPr>
-      <w:r>
-        <w:rPr>
-          <w:rFonts w:ascii="Calibri" w:hAnsi="Calibri"/>
-          <w:b/>
-          <w:color w:val="1E293B"/>
-          <w:sz w:val="22"/>
-        </w:rPr>
-        <w:t xml:space="preserve">Overview: </w:t>
-      </w:r>
-      <w:r>
-        <w:rPr>
-          <w:rFonts w:ascii="Calibri" w:hAnsi="Calibri"/>
-          <w:color w:val="334155"/>
-          <w:sz w:val="22"/>
-        </w:rPr>
-        <w:t>Enables users to log into a desktop browser by scanning a QR code with an authenticated mobile device camera.</w:t>
-      </w:r>
-    </w:p>
-    <w:p>
-      <w:pPr>
-        <w:pStyle w:val="ListBullet"/>
-        <w:spacing w:before="0" w:after="80" w:line="276" w:lineRule="auto"/>
-      </w:pPr>
-      <w:r>
-        <w:rPr>
-          <w:rFonts w:ascii="Calibri" w:hAnsi="Calibri"/>
-          <w:b/>
-          <w:color w:val="0F172A"/>
-          <w:sz w:val="21"/>
-        </w:rPr>
-        <w:t xml:space="preserve">Desktop Generation (/api/auth/qr/generate): </w:t>
-      </w:r>
-      <w:r>
-        <w:rPr>
-          <w:rFonts w:ascii="Calibri" w:hAnsi="Calibri"/>
-          <w:color w:val="334155"/>
-          <w:sz w:val="21"/>
-        </w:rPr>
-        <w:t>Generates a unique QR requestId with a 60-second TTL and renders a dynamic QR code on the desktop.</w:t>
-      </w:r>
-    </w:p>
-    <w:p>
-      <w:pPr>
-        <w:pStyle w:val="ListBullet"/>
-        <w:spacing w:before="0" w:after="80" w:line="276" w:lineRule="auto"/>
-      </w:pPr>
-      <w:r>
-        <w:rPr>
-          <w:rFonts w:ascii="Calibri" w:hAnsi="Calibri"/>
-          <w:b/>
-          <w:color w:val="0F172A"/>
-          <w:sz w:val="21"/>
-        </w:rPr>
-        <w:t xml:space="preserve">Mobile Scan &amp; Inspection: </w:t>
-      </w:r>
-      <w:r>
-        <w:rPr>
-          <w:rFonts w:ascii="Calibri" w:hAnsi="Calibri"/>
-          <w:color w:val="334155"/>
-          <w:sz w:val="21"/>
-        </w:rPr>
-        <w:t>Mobile camera scans QR code, opening MobileQRScannerModal / /qr-approve page.</w:t>
-      </w:r>
-    </w:p>
-    <w:p>
-      <w:pPr>
-        <w:pStyle w:val="ListBullet"/>
-        <w:spacing w:before="0" w:after="80" w:line="276" w:lineRule="auto"/>
-      </w:pPr>
-      <w:r>
-        <w:rPr>
-          <w:rFonts w:ascii="Calibri" w:hAnsi="Calibri"/>
-          <w:b/>
-          <w:color w:val="0F172A"/>
-          <w:sz w:val="21"/>
-        </w:rPr>
-        <w:t xml:space="preserve">Mobile Approval (/api/auth/qr/approve): </w:t>
-      </w:r>
-      <w:r>
-        <w:rPr>
-          <w:rFonts w:ascii="Calibri" w:hAnsi="Calibri"/>
-          <w:color w:val="334155"/>
-          <w:sz w:val="21"/>
-        </w:rPr>
-        <w:t>When mobile user clicks 'Approve', /api/auth/qr/approve updates request status to 'approved' and mints a Desktop session.</w:t>
-      </w:r>
-    </w:p>
-    <w:p>
-      <w:pPr>
-        <w:pStyle w:val="ListBullet"/>
-        <w:spacing w:before="0" w:after="80" w:line="276" w:lineRule="auto"/>
-      </w:pPr>
-      <w:r>
-        <w:rPr>
-          <w:rFonts w:ascii="Calibri" w:hAnsi="Calibri"/>
-          <w:b/>
-          <w:color w:val="0F172A"/>
-          <w:sz w:val="21"/>
-        </w:rPr>
-        <w:t xml:space="preserve">Desktop Polling (/api/auth/qr/status): </w:t>
-      </w:r>
-      <w:r>
-        <w:rPr>
-          <w:rFonts w:ascii="Calibri" w:hAnsi="Calibri"/>
-          <w:color w:val="334155"/>
-          <w:sz w:val="21"/>
-        </w:rPr>
-        <w:t>Desktop long-polls /api/auth/qr/status every 2 seconds. Upon approval, receives session token and redirects to Dashboard.</w:t>
-      </w:r>
-    </w:p>
-    <w:p>
-      <w:pPr>
-        <w:keepNext/>
-        <w:spacing w:before="280" w:after="120"/>
-      </w:pPr>
-      <w:r>
-        <w:rPr>
-          <w:rFonts w:ascii="Calibri" w:hAnsi="Calibri"/>
-          <w:b/>
-          <w:color w:val="2563EB"/>
-          <w:sz w:val="28"/>
-        </w:rPr>
-        <w:t>2.4 Strictly Isolated Demo Mode</w:t>
-      </w:r>
-    </w:p>
-    <w:p>
-      <w:pPr>
-        <w:spacing w:before="0" w:after="120" w:line="276" w:lineRule="auto"/>
-      </w:pPr>
-      <w:r>
-        <w:rPr>
-          <w:rFonts w:ascii="Calibri" w:hAnsi="Calibri"/>
-          <w:b/>
-          <w:color w:val="1E293B"/>
-          <w:sz w:val="22"/>
-        </w:rPr>
-        <w:t xml:space="preserve">Overview: </w:t>
-      </w:r>
-      <w:r>
-        <w:rPr>
-          <w:rFonts w:ascii="Calibri" w:hAnsi="Calibri"/>
-          <w:color w:val="334155"/>
-          <w:sz w:val="22"/>
-        </w:rPr>
-        <w:t>Demo Mode allows prospective users to test the platform without sending real emails or modifying production data.</w:t>
-      </w:r>
-    </w:p>
-    <w:p>
-      <w:pPr>
-        <w:pStyle w:val="ListBullet"/>
-        <w:spacing w:before="0" w:after="80" w:line="276" w:lineRule="auto"/>
-      </w:pPr>
-      <w:r>
-        <w:rPr>
-          <w:rFonts w:ascii="Calibri" w:hAnsi="Calibri"/>
-          <w:b/>
-          <w:color w:val="0F172A"/>
-          <w:sz w:val="21"/>
-        </w:rPr>
-        <w:t xml:space="preserve">Architecture Reuse: </w:t>
-      </w:r>
-      <w:r>
-        <w:rPr>
-          <w:rFonts w:ascii="Calibri" w:hAnsi="Calibri"/>
-          <w:color w:val="334155"/>
-          <w:sz w:val="21"/>
-        </w:rPr>
-        <w:t>Triggered via 'Get Demo' CTA on landing page, setting isDemo = true in useAuth store.</w:t>
-      </w:r>
-    </w:p>
-    <w:p>
-      <w:pPr>
-        <w:pStyle w:val="ListBullet"/>
-        <w:spacing w:before="0" w:after="80" w:line="276" w:lineRule="auto"/>
-      </w:pPr>
-      <w:r>
-        <w:rPr>
-          <w:rFonts w:ascii="Calibri" w:hAnsi="Calibri"/>
-          <w:b/>
-          <w:color w:val="0F172A"/>
-          <w:sz w:val="21"/>
-        </w:rPr>
-        <w:t xml:space="preserve">Passkey Handling: </w:t>
-      </w:r>
-      <w:r>
-        <w:rPr>
-          <w:rFonts w:ascii="Calibri" w:hAnsi="Calibri"/>
-          <w:color w:val="334155"/>
-          <w:sz w:val="21"/>
-        </w:rPr>
-        <w:t>Passkey option is automatically hidden in AuthPage.</w:t>
-      </w:r>
-    </w:p>
-    <w:p>
-      <w:pPr>
-        <w:pStyle w:val="ListBullet"/>
-        <w:spacing w:before="0" w:after="80" w:line="276" w:lineRule="auto"/>
-      </w:pPr>
-      <w:r>
-        <w:rPr>
-          <w:rFonts w:ascii="Calibri" w:hAnsi="Calibri"/>
-          <w:b/>
-          <w:color w:val="0F172A"/>
-          <w:sz w:val="21"/>
-        </w:rPr>
-        <w:t xml:space="preserve">Biometrics Handling: </w:t>
-      </w:r>
-      <w:r>
-        <w:rPr>
-          <w:rFonts w:ascii="Calibri" w:hAnsi="Calibri"/>
-          <w:color w:val="334155"/>
-          <w:sz w:val="21"/>
-        </w:rPr>
-        <w:t>Clicking Biometrics displays toast: 'Biometric Authentication is currently under development.'</w:t>
-      </w:r>
-    </w:p>
-    <w:p>
-      <w:pPr>
-        <w:pStyle w:val="ListBullet"/>
-        <w:spacing w:before="0" w:after="80" w:line="276" w:lineRule="auto"/>
-      </w:pPr>
-      <w:r>
-        <w:rPr>
-          <w:rFonts w:ascii="Calibri" w:hAnsi="Calibri"/>
-          <w:b/>
-          <w:color w:val="0F172A"/>
-          <w:sz w:val="21"/>
-        </w:rPr>
-        <w:t xml:space="preserve">Email OTP Toast Display: </w:t>
-      </w:r>
-      <w:r>
-        <w:rPr>
-          <w:rFonts w:ascii="Calibri" w:hAnsi="Calibri"/>
-          <w:color w:val="334155"/>
-          <w:sz w:val="21"/>
-        </w:rPr>
-        <w:t>Accepts any email address. Skips Resend email API call and displays code ONLY as a toast notification: 'Demo Mode — Verification Code: XXXXXX'. Code is never rendered in page text.</w:t>
-      </w:r>
-    </w:p>
-    <w:p>
-      <w:pPr>
-        <w:pStyle w:val="ListBullet"/>
-        <w:spacing w:before="0" w:after="80" w:line="276" w:lineRule="auto"/>
-      </w:pPr>
-      <w:r>
-        <w:rPr>
-          <w:rFonts w:ascii="Calibri" w:hAnsi="Calibri"/>
-          <w:b/>
-          <w:color w:val="0F172A"/>
-          <w:sz w:val="21"/>
-        </w:rPr>
-        <w:t xml:space="preserve">Data Isolation &amp; Auto-Cleanup: </w:t>
-      </w:r>
-      <w:r>
-        <w:rPr>
-          <w:rFonts w:ascii="Calibri" w:hAnsi="Calibri"/>
-          <w:color w:val="334155"/>
-          <w:sz w:val="21"/>
-        </w:rPr>
-        <w:t>All database rows created carry isDemo = true. Calling /api/demo/cleanup or logging out purges all demo records.</w:t>
-      </w:r>
-    </w:p>
-    <w:p>
-      <w:pPr>
-        <w:keepNext/>
-        <w:spacing w:before="280" w:after="120"/>
-      </w:pPr>
-      <w:r>
-        <w:rPr>
-          <w:rFonts w:ascii="Calibri" w:hAnsi="Calibri"/>
-          <w:b/>
-          <w:color w:val="2563EB"/>
-          <w:sz w:val="28"/>
-        </w:rPr>
-        <w:t>2.5 Session Management &amp; Device Detection</w:t>
-      </w:r>
-    </w:p>
-    <w:p>
-      <w:pPr>
-        <w:spacing w:before="0" w:after="120" w:line="276" w:lineRule="auto"/>
-      </w:pPr>
-      <w:r>
-        <w:rPr>
-          <w:rFonts w:ascii="Calibri" w:hAnsi="Calibri"/>
-          <w:b/>
-          <w:color w:val="1E293B"/>
-          <w:sz w:val="22"/>
-        </w:rPr>
-        <w:t xml:space="preserve">Overview: </w:t>
-      </w:r>
-      <w:r>
-        <w:rPr>
-          <w:rFonts w:ascii="Calibri" w:hAnsi="Calibri"/>
-          <w:color w:val="334155"/>
-          <w:sz w:val="22"/>
-        </w:rPr>
-        <w:t>A comprehensive session management system providing real-time tracking, physical device fingerprinting, single/bulk revocation, and detail inspection.</w:t>
-      </w:r>
-    </w:p>
-    <w:p>
-      <w:pPr>
-        <w:pStyle w:val="ListBullet"/>
-        <w:spacing w:before="0" w:after="80" w:line="276" w:lineRule="auto"/>
-      </w:pPr>
-      <w:r>
-        <w:rPr>
-          <w:rFonts w:ascii="Calibri" w:hAnsi="Calibri"/>
-          <w:b/>
-          <w:color w:val="0F172A"/>
-          <w:sz w:val="21"/>
-        </w:rPr>
-        <w:t xml:space="preserve">Deterministic Fingerprinting (src/lib/device.ts): </w:t>
-      </w:r>
-      <w:r>
-        <w:rPr>
-          <w:rFonts w:ascii="Calibri" w:hAnsi="Calibri"/>
-          <w:color w:val="334155"/>
-          <w:sz w:val="21"/>
-        </w:rPr>
-        <w:t>Parses User-Agent &amp; IP into OS, Browser version, Device Name (Windows 11 Laptop, iPhone 15 Pro, Android Phone, MacBook Pro), Device Type (Laptop, Desktop, Mobile, Tablet), Location (Pune, Maharashtra, India), and Fingerprint.</w:t>
-      </w:r>
-    </w:p>
-    <w:p>
-      <w:pPr>
-        <w:pStyle w:val="ListBullet"/>
-        <w:spacing w:before="0" w:after="80" w:line="276" w:lineRule="auto"/>
-      </w:pPr>
-      <w:r>
-        <w:rPr>
-          <w:rFonts w:ascii="Calibri" w:hAnsi="Calibri"/>
-          <w:b/>
-          <w:color w:val="0F172A"/>
-          <w:sz w:val="21"/>
-        </w:rPr>
-        <w:t xml:space="preserve">Dual Timestamps &amp; Status: </w:t>
-      </w:r>
-      <w:r>
-        <w:rPr>
-          <w:rFonts w:ascii="Calibri" w:hAnsi="Calibri"/>
-          <w:color w:val="334155"/>
-          <w:sz w:val="21"/>
-        </w:rPr>
-        <w:t>Tracks lastActivity (user interaction) and lastSeen (heartbeat). Calculates status: Active, Idle (&gt;15m inactivity), Expired, Revoked.</w:t>
-      </w:r>
-    </w:p>
-    <w:p>
-      <w:pPr>
-        <w:pStyle w:val="ListBullet"/>
-        <w:spacing w:before="0" w:after="80" w:line="276" w:lineRule="auto"/>
-      </w:pPr>
-      <w:r>
-        <w:rPr>
-          <w:rFonts w:ascii="Calibri" w:hAnsi="Calibri"/>
-          <w:b/>
-          <w:color w:val="0F172A"/>
-          <w:sz w:val="21"/>
-        </w:rPr>
-        <w:t xml:space="preserve">Device Deduplication: </w:t>
-      </w:r>
-      <w:r>
-        <w:rPr>
-          <w:rFonts w:ascii="Calibri" w:hAnsi="Calibri"/>
-          <w:color w:val="334155"/>
-          <w:sz w:val="21"/>
-        </w:rPr>
-        <w:t>POST /api/auth/session replaces older sessions for the same device fingerprint. GET /api/auth/sessions deduplicates physical device sessions so Active Sessions strictly equals active parallel physical devices.</w:t>
-      </w:r>
-    </w:p>
-    <w:p>
-      <w:pPr>
-        <w:pStyle w:val="ListBullet"/>
-        <w:spacing w:before="0" w:after="80" w:line="276" w:lineRule="auto"/>
-      </w:pPr>
-      <w:r>
-        <w:rPr>
-          <w:rFonts w:ascii="Calibri" w:hAnsi="Calibri"/>
-          <w:b/>
-          <w:color w:val="0F172A"/>
-          <w:sz w:val="21"/>
-        </w:rPr>
-        <w:t xml:space="preserve">Logout Invalidation: </w:t>
-      </w:r>
-      <w:r>
-        <w:rPr>
-          <w:rFonts w:ascii="Calibri" w:hAnsi="Calibri"/>
-          <w:color w:val="334155"/>
-          <w:sz w:val="21"/>
-        </w:rPr>
-        <w:t>logout() in useAuth calls DELETE /api/auth/session to delete session token from SQLite immediately upon logout.</w:t>
-      </w:r>
-    </w:p>
-    <w:p>
-      <w:pPr>
-        <w:pStyle w:val="ListBullet"/>
-        <w:spacing w:before="0" w:after="80" w:line="276" w:lineRule="auto"/>
-      </w:pPr>
-      <w:r>
-        <w:rPr>
-          <w:rFonts w:ascii="Calibri" w:hAnsi="Calibri"/>
-          <w:b/>
-          <w:color w:val="0F172A"/>
-          <w:sz w:val="21"/>
-        </w:rPr>
-        <w:t xml:space="preserve">Bulk Revocation (Logout All Other Devices): </w:t>
-      </w:r>
-      <w:r>
-        <w:rPr>
-          <w:rFonts w:ascii="Calibri" w:hAnsi="Calibri"/>
-          <w:color w:val="334155"/>
-          <w:sz w:val="21"/>
-        </w:rPr>
-        <w:t>Revokes all sessions except current active session token and logs audit trail.</w:t>
-      </w:r>
-    </w:p>
-    <w:p>
-      <w:pPr>
-        <w:pStyle w:val="ListBullet"/>
-        <w:spacing w:before="0" w:after="80" w:line="276" w:lineRule="auto"/>
-      </w:pPr>
-      <w:r>
-        <w:rPr>
-          <w:rFonts w:ascii="Calibri" w:hAnsi="Calibri"/>
-          <w:b/>
-          <w:color w:val="0F172A"/>
-          <w:sz w:val="21"/>
-        </w:rPr>
-        <w:t xml:space="preserve">Session Detail Modal: </w:t>
-      </w:r>
-      <w:r>
-        <w:rPr>
-          <w:rFonts w:ascii="Calibri" w:hAnsi="Calibri"/>
-          <w:color w:val="334155"/>
-          <w:sz w:val="21"/>
-        </w:rPr>
-        <w:t>Displays fingerprint, user agent, platform, resolution, network type, timezone, duration, and Authentication Strength Indicator (e.g. Passkey: 98% Very Strong vs OTP: 85% Strong).</w:t>
-      </w:r>
-    </w:p>
-    <w:p>
-      <w:pPr>
-        <w:keepNext/>
-        <w:spacing w:before="280" w:after="120"/>
-      </w:pPr>
-      <w:r>
-        <w:rPr>
-          <w:rFonts w:ascii="Calibri" w:hAnsi="Calibri"/>
-          <w:b/>
-          <w:color w:val="2563EB"/>
-          <w:sz w:val="28"/>
-        </w:rPr>
-        <w:t>2.6 Adaptive Risk Engine &amp; Security Analytics</w:t>
-      </w:r>
-    </w:p>
-    <w:p>
-      <w:pPr>
-        <w:pStyle w:val="ListBullet"/>
-        <w:spacing w:before="0" w:after="80" w:line="276" w:lineRule="auto"/>
-      </w:pPr>
-      <w:r>
-        <w:rPr>
-          <w:rFonts w:ascii="Calibri" w:hAnsi="Calibri"/>
-          <w:b/>
-          <w:color w:val="0F172A"/>
-          <w:sz w:val="21"/>
-        </w:rPr>
-        <w:t xml:space="preserve">Adaptive Risk Engine (/api/auth/risk): </w:t>
-      </w:r>
-      <w:r>
-        <w:rPr>
-          <w:rFonts w:ascii="Calibri" w:hAnsi="Calibri"/>
-          <w:color w:val="334155"/>
-          <w:sz w:val="21"/>
-        </w:rPr>
-        <w:t>Inspects device fingerprint, IP address, and location similarity. Evaluates risk score (0-100) and risk level (Low, Medium, High).</w:t>
-      </w:r>
-    </w:p>
-    <w:p>
-      <w:pPr>
-        <w:pStyle w:val="ListBullet"/>
-        <w:spacing w:before="0" w:after="80" w:line="276" w:lineRule="auto"/>
-      </w:pPr>
-      <w:r>
-        <w:rPr>
-          <w:rFonts w:ascii="Calibri" w:hAnsi="Calibri"/>
-          <w:b/>
-          <w:color w:val="0F172A"/>
-          <w:sz w:val="21"/>
-        </w:rPr>
-        <w:t xml:space="preserve">New Device Detection &amp; Verification: </w:t>
-      </w:r>
-      <w:r>
-        <w:rPr>
-          <w:rFonts w:ascii="Calibri" w:hAnsi="Calibri"/>
-          <w:color w:val="334155"/>
-          <w:sz w:val="21"/>
-        </w:rPr>
-        <w:t>Triggers New Device Modal upon login from unrecognized fingerprint, offering 'Yes, it's me' (trust device) or 'No, it's not me' (instant revocation + high risk alert).</w:t>
-      </w:r>
-    </w:p>
-    <w:p>
-      <w:pPr>
-        <w:pStyle w:val="ListBullet"/>
-        <w:spacing w:before="0" w:after="80" w:line="276" w:lineRule="auto"/>
-      </w:pPr>
-      <w:r>
-        <w:rPr>
-          <w:rFonts w:ascii="Calibri" w:hAnsi="Calibri"/>
-          <w:b/>
-          <w:color w:val="0F172A"/>
-          <w:sz w:val="21"/>
-        </w:rPr>
-        <w:t xml:space="preserve">Security Analytics (/api/auth/analytics): </w:t>
-      </w:r>
-      <w:r>
-        <w:rPr>
-          <w:rFonts w:ascii="Calibri" w:hAnsi="Calibri"/>
-          <w:color w:val="334155"/>
-          <w:sz w:val="21"/>
-        </w:rPr>
-        <w:t>Renders interactive Recharts Pie chart (auth usage breakdown), Bar chart (risk distribution), and 7-day login trend.</w:t>
-      </w:r>
-    </w:p>
-    <w:p>
-      <w:pPr>
-        <w:pStyle w:val="ListBullet"/>
-        <w:spacing w:before="0" w:after="80" w:line="276" w:lineRule="auto"/>
-      </w:pPr>
-      <w:r>
-        <w:rPr>
-          <w:rFonts w:ascii="Calibri" w:hAnsi="Calibri"/>
-          <w:b/>
-          <w:color w:val="0F172A"/>
-          <w:sz w:val="21"/>
-        </w:rPr>
-        <w:t xml:space="preserve">Emergency Lockdown (/api/auth/lockdown): </w:t>
-      </w:r>
-      <w:r>
-        <w:rPr>
-          <w:rFonts w:ascii="Calibri" w:hAnsi="Calibri"/>
-          <w:color w:val="334155"/>
-          <w:sz w:val="21"/>
-        </w:rPr>
-        <w:t>Allows instant emergency session purge, QR login disabling, passkey disabling, or strict OTP enforcement.</w:t>
-      </w:r>
-    </w:p>
-    <w:p>
-      <w:pPr>
-        <w:pStyle w:val="ListBullet"/>
-        <w:spacing w:before="0" w:after="80" w:line="276" w:lineRule="auto"/>
-      </w:pPr>
-      <w:r>
-        <w:rPr>
-          <w:rFonts w:ascii="Calibri" w:hAnsi="Calibri"/>
-          <w:b/>
-          <w:color w:val="0F172A"/>
-          <w:sz w:val="21"/>
-        </w:rPr>
-        <w:t xml:space="preserve">Settings Panel: </w:t>
-      </w:r>
-      <w:r>
-        <w:rPr>
-          <w:rFonts w:ascii="Calibri" w:hAnsi="Calibri"/>
-          <w:color w:val="334155"/>
-          <w:sz w:val="21"/>
-        </w:rPr>
-        <w:t>Vertical navigation layout for appearance theme, security policies (device limit, session timeout), account details, and alerts.</w:t>
-      </w:r>
-    </w:p>
-    <w:p>
-      <w:pPr>
-        <w:keepNext/>
-        <w:spacing w:before="360" w:after="160"/>
-      </w:pPr>
-      <w:r>
-        <w:rPr>
-          <w:rFonts w:ascii="Calibri" w:hAnsi="Calibri"/>
-          <w:b/>
-          <w:color w:val="0F172A"/>
-          <w:sz w:val="36"/>
-        </w:rPr>
-        <w:t>3. Database Schema &amp; Entity Relationships</w:t>
-      </w:r>
-    </w:p>
-    <w:p>
-      <w:pPr>
-        <w:spacing w:before="0" w:after="120" w:line="276" w:lineRule="auto"/>
-      </w:pPr>
-      <w:r>
-        <w:rPr>
-          <w:rFonts w:ascii="Calibri" w:hAnsi="Calibri"/>
-          <w:b/>
-          <w:color w:val="1E293B"/>
-          <w:sz w:val="22"/>
-        </w:rPr>
-        <w:t xml:space="preserve">Overview: </w:t>
-      </w:r>
-      <w:r>
-        <w:rPr>
-          <w:rFonts w:ascii="Calibri" w:hAnsi="Calibri"/>
-          <w:color w:val="334155"/>
-          <w:sz w:val="22"/>
-        </w:rPr>
-        <w:t>The database is defined in prisma/schema.prisma using SQLite. Below is the table specification summarizing key models.</w:t>
-      </w:r>
-    </w:p>
-    <w:tbl>
-      <w:tblPr>
-        <w:tblW w:type="auto" w:w="0"/>
-        <w:jc w:val="center"/>
-        <w:tblLook w:firstColumn="1" w:firstRow="1" w:lastColumn="0" w:lastRow="0" w:noHBand="0" w:noVBand="1" w:val="04A0"/>
-      </w:tblPr>
-      <w:tblGrid>
-        <w:gridCol w:w="2340"/>
-        <w:gridCol w:w="2340"/>
-        <w:gridCol w:w="2340"/>
-        <w:gridCol w:w="2340"/>
-      </w:tblGrid>
-      <w:tr>
-        <w:tc>
-          <w:tcPr>
-            <w:tcW w:type="dxa" w:w="2160"/>
-            <w:shd w:fill="0F172A"/>
-            <w:tcMar>
-              <w:top w:w="120" w:type="dxa"/>
-              <w:bottom w:w="120" w:type="dxa"/>
-              <w:left w:w="150" w:type="dxa"/>
-              <w:right w:w="150" w:type="dxa"/>
-            </w:tcMar>
-          </w:tcPr>
-          <w:p>
-            <w:pPr>
-              <w:jc w:val="left"/>
-            </w:pPr>
-            <w:r>
-              <w:rPr>
-                <w:rFonts w:ascii="Calibri" w:hAnsi="Calibri"/>
-                <w:b/>
-                <w:color w:val="FFFFFF"/>
-                <w:sz w:val="20"/>
-              </w:rPr>
-              <w:t>Model Name</w:t>
-            </w:r>
-          </w:p>
-        </w:tc>
-        <w:tc>
-          <w:tcPr>
-            <w:tcW w:type="dxa" w:w="2160"/>
-            <w:shd w:fill="0F172A"/>
-            <w:tcMar>
-              <w:top w:w="120" w:type="dxa"/>
-              <w:bottom w:w="120" w:type="dxa"/>
-              <w:left w:w="150" w:type="dxa"/>
-              <w:right w:w="150" w:type="dxa"/>
-            </w:tcMar>
-          </w:tcPr>
-          <w:p>
-            <w:pPr>
-              <w:jc w:val="left"/>
-            </w:pPr>
-            <w:r>
-              <w:rPr>
-                <w:rFonts w:ascii="Calibri" w:hAnsi="Calibri"/>
-                <w:b/>
-                <w:color w:val="FFFFFF"/>
-                <w:sz w:val="20"/>
-              </w:rPr>
-              <w:t>Primary Key</w:t>
-            </w:r>
-          </w:p>
-        </w:tc>
-        <w:tc>
-          <w:tcPr>
-            <w:tcW w:type="dxa" w:w="3168"/>
-            <w:shd w:fill="0F172A"/>
-            <w:tcMar>
-              <w:top w:w="120" w:type="dxa"/>
-              <w:bottom w:w="120" w:type="dxa"/>
-              <w:left w:w="150" w:type="dxa"/>
-              <w:right w:w="150" w:type="dxa"/>
-            </w:tcMar>
-          </w:tcPr>
-          <w:p>
-            <w:pPr>
-              <w:jc w:val="left"/>
-            </w:pPr>
-            <w:r>
-              <w:rPr>
-                <w:rFonts w:ascii="Calibri" w:hAnsi="Calibri"/>
-                <w:b/>
-                <w:color w:val="FFFFFF"/>
-                <w:sz w:val="20"/>
-              </w:rPr>
-              <w:t>Key Attributes</w:t>
-            </w:r>
-          </w:p>
-        </w:tc>
-        <w:tc>
-          <w:tcPr>
-            <w:tcW w:type="dxa" w:w="1872"/>
-            <w:shd w:fill="0F172A"/>
-            <w:tcMar>
-              <w:top w:w="120" w:type="dxa"/>
-              <w:bottom w:w="120" w:type="dxa"/>
-              <w:left w:w="150" w:type="dxa"/>
-              <w:right w:w="150" w:type="dxa"/>
-            </w:tcMar>
-          </w:tcPr>
-          <w:p>
-            <w:pPr>
-              <w:jc w:val="left"/>
-            </w:pPr>
-            <w:r>
-              <w:rPr>
-                <w:rFonts w:ascii="Calibri" w:hAnsi="Calibri"/>
-                <w:b/>
-                <w:color w:val="FFFFFF"/>
-                <w:sz w:val="20"/>
-              </w:rPr>
-              <w:t>Relations</w:t>
-            </w:r>
-          </w:p>
-        </w:tc>
-      </w:tr>
-      <w:tr>
-        <w:tc>
-          <w:tcPr>
-            <w:tcW w:type="dxa" w:w="2160"/>
-            <w:shd w:fill="FFFFFF"/>
-            <w:tcMar>
-              <w:top w:w="100" w:type="dxa"/>
-              <w:bottom w:w="100" w:type="dxa"/>
-              <w:left w:w="150" w:type="dxa"/>
-              <w:right w:w="150" w:type="dxa"/>
-            </w:tcMar>
-          </w:tcPr>
-          <w:p>
-            <w:r>
-              <w:rPr>
-                <w:rFonts w:ascii="Calibri" w:hAnsi="Calibri"/>
-                <w:color w:val="334155"/>
-                <w:sz w:val="19"/>
-              </w:rPr>
-              <w:t>User</w:t>
-            </w:r>
-          </w:p>
-        </w:tc>
-        <w:tc>
-          <w:tcPr>
-            <w:tcW w:type="dxa" w:w="2160"/>
-            <w:shd w:fill="FFFFFF"/>
-            <w:tcMar>
-              <w:top w:w="100" w:type="dxa"/>
-              <w:bottom w:w="100" w:type="dxa"/>
-              <w:left w:w="150" w:type="dxa"/>
-              <w:right w:w="150" w:type="dxa"/>
-            </w:tcMar>
-          </w:tcPr>
-          <w:p>
-            <w:r>
-              <w:rPr>
-                <w:rFonts w:ascii="Calibri" w:hAnsi="Calibri"/>
-                <w:color w:val="334155"/>
-                <w:sz w:val="19"/>
-              </w:rPr>
-              <w:t>id (cuid)</w:t>
-            </w:r>
-          </w:p>
-        </w:tc>
-        <w:tc>
-          <w:tcPr>
-            <w:tcW w:type="dxa" w:w="3168"/>
-            <w:shd w:fill="FFFFFF"/>
-            <w:tcMar>
-              <w:top w:w="100" w:type="dxa"/>
-              <w:bottom w:w="100" w:type="dxa"/>
-              <w:left w:w="150" w:type="dxa"/>
-              <w:right w:w="150" w:type="dxa"/>
-            </w:tcMar>
-          </w:tcPr>
-          <w:p>
-            <w:r>
-              <w:rPr>
-                <w:rFonts w:ascii="Calibri" w:hAnsi="Calibri"/>
-                <w:color w:val="334155"/>
-                <w:sz w:val="19"/>
-              </w:rPr>
-              <w:t>email, name, phone, isDemo, emailVerified</w:t>
-            </w:r>
-          </w:p>
-        </w:tc>
-        <w:tc>
-          <w:tcPr>
-            <w:tcW w:type="dxa" w:w="1872"/>
-            <w:shd w:fill="FFFFFF"/>
-            <w:tcMar>
-              <w:top w:w="100" w:type="dxa"/>
-              <w:bottom w:w="100" w:type="dxa"/>
-              <w:left w:w="150" w:type="dxa"/>
-              <w:right w:w="150" w:type="dxa"/>
-            </w:tcMar>
-          </w:tcPr>
-          <w:p>
-            <w:r>
-              <w:rPr>
-                <w:rFonts w:ascii="Calibri" w:hAnsi="Calibri"/>
-                <w:color w:val="334155"/>
-                <w:sz w:val="19"/>
-              </w:rPr>
-              <w:t>sessions, passkeys, trustedDevices</w:t>
-            </w:r>
-          </w:p>
-        </w:tc>
-      </w:tr>
-      <w:tr>
-        <w:tc>
-          <w:tcPr>
-            <w:tcW w:type="dxa" w:w="2160"/>
-            <w:shd w:fill="F8FAFC"/>
-            <w:tcMar>
-              <w:top w:w="100" w:type="dxa"/>
-              <w:bottom w:w="100" w:type="dxa"/>
-              <w:left w:w="150" w:type="dxa"/>
-              <w:right w:w="150" w:type="dxa"/>
-            </w:tcMar>
-          </w:tcPr>
-          <w:p>
-            <w:r>
-              <w:rPr>
-                <w:rFonts w:ascii="Calibri" w:hAnsi="Calibri"/>
-                <w:color w:val="334155"/>
-                <w:sz w:val="19"/>
-              </w:rPr>
-              <w:t>Session</w:t>
-            </w:r>
-          </w:p>
-        </w:tc>
-        <w:tc>
-          <w:tcPr>
-            <w:tcW w:type="dxa" w:w="2160"/>
-            <w:shd w:fill="F8FAFC"/>
-            <w:tcMar>
-              <w:top w:w="100" w:type="dxa"/>
-              <w:bottom w:w="100" w:type="dxa"/>
-              <w:left w:w="150" w:type="dxa"/>
-              <w:right w:w="150" w:type="dxa"/>
-            </w:tcMar>
-          </w:tcPr>
-          <w:p>
-            <w:r>
-              <w:rPr>
-                <w:rFonts w:ascii="Calibri" w:hAnsi="Calibri"/>
-                <w:color w:val="334155"/>
-                <w:sz w:val="19"/>
-              </w:rPr>
-              <w:t>id (cuid)</w:t>
-            </w:r>
-          </w:p>
-        </w:tc>
-        <w:tc>
-          <w:tcPr>
-            <w:tcW w:type="dxa" w:w="3168"/>
-            <w:shd w:fill="F8FAFC"/>
-            <w:tcMar>
-              <w:top w:w="100" w:type="dxa"/>
-              <w:bottom w:w="100" w:type="dxa"/>
-              <w:left w:w="150" w:type="dxa"/>
-              <w:right w:w="150" w:type="dxa"/>
-            </w:tcMar>
-          </w:tcPr>
-          <w:p>
-            <w:r>
-              <w:rPr>
-                <w:rFonts w:ascii="Calibri" w:hAnsi="Calibri"/>
-                <w:color w:val="334155"/>
-                <w:sz w:val="19"/>
-              </w:rPr>
-              <w:t>token, deviceName, deviceType, browser, os, deviceFingerprint, loginMethod, status, lastActivity, lastSeen, expiresAt</w:t>
-            </w:r>
-          </w:p>
-        </w:tc>
-        <w:tc>
-          <w:tcPr>
-            <w:tcW w:type="dxa" w:w="1872"/>
-            <w:shd w:fill="F8FAFC"/>
-            <w:tcMar>
-              <w:top w:w="100" w:type="dxa"/>
-              <w:bottom w:w="100" w:type="dxa"/>
-              <w:left w:w="150" w:type="dxa"/>
-              <w:right w:w="150" w:type="dxa"/>
-            </w:tcMar>
-          </w:tcPr>
-          <w:p>
-            <w:r>
-              <w:rPr>
-                <w:rFonts w:ascii="Calibri" w:hAnsi="Calibri"/>
-                <w:color w:val="334155"/>
-                <w:sz w:val="19"/>
-              </w:rPr>
-              <w:t>user (Cascade)</w:t>
-            </w:r>
-          </w:p>
-        </w:tc>
-      </w:tr>
-      <w:tr>
-        <w:tc>
-          <w:tcPr>
-            <w:tcW w:type="dxa" w:w="2160"/>
-            <w:shd w:fill="FFFFFF"/>
-            <w:tcMar>
-              <w:top w:w="100" w:type="dxa"/>
-              <w:bottom w:w="100" w:type="dxa"/>
-              <w:left w:w="150" w:type="dxa"/>
-              <w:right w:w="150" w:type="dxa"/>
-            </w:tcMar>
-          </w:tcPr>
-          <w:p>
-            <w:r>
-              <w:rPr>
-                <w:rFonts w:ascii="Calibri" w:hAnsi="Calibri"/>
-                <w:color w:val="334155"/>
-                <w:sz w:val="19"/>
-              </w:rPr>
-              <w:t>PasskeyCredential</w:t>
-            </w:r>
-          </w:p>
-        </w:tc>
-        <w:tc>
-          <w:tcPr>
-            <w:tcW w:type="dxa" w:w="2160"/>
-            <w:shd w:fill="FFFFFF"/>
-            <w:tcMar>
-              <w:top w:w="100" w:type="dxa"/>
-              <w:bottom w:w="100" w:type="dxa"/>
-              <w:left w:w="150" w:type="dxa"/>
-              <w:right w:w="150" w:type="dxa"/>
-            </w:tcMar>
-          </w:tcPr>
-          <w:p>
-            <w:r>
-              <w:rPr>
-                <w:rFonts w:ascii="Calibri" w:hAnsi="Calibri"/>
-                <w:color w:val="334155"/>
-                <w:sz w:val="19"/>
-              </w:rPr>
-              <w:t>id (cuid)</w:t>
-            </w:r>
-          </w:p>
-        </w:tc>
-        <w:tc>
-          <w:tcPr>
-            <w:tcW w:type="dxa" w:w="3168"/>
-            <w:shd w:fill="FFFFFF"/>
-            <w:tcMar>
-              <w:top w:w="100" w:type="dxa"/>
-              <w:bottom w:w="100" w:type="dxa"/>
-              <w:left w:w="150" w:type="dxa"/>
-              <w:right w:w="150" w:type="dxa"/>
-            </w:tcMar>
-          </w:tcPr>
-          <w:p>
-            <w:r>
-              <w:rPr>
-                <w:rFonts w:ascii="Calibri" w:hAnsi="Calibri"/>
-                <w:color w:val="334155"/>
-                <w:sz w:val="19"/>
-              </w:rPr>
-              <w:t>credentialId, publicKey, counter, deviceType</w:t>
-            </w:r>
-          </w:p>
-        </w:tc>
-        <w:tc>
-          <w:tcPr>
-            <w:tcW w:type="dxa" w:w="1872"/>
-            <w:shd w:fill="FFFFFF"/>
-            <w:tcMar>
-              <w:top w:w="100" w:type="dxa"/>
-              <w:bottom w:w="100" w:type="dxa"/>
-              <w:left w:w="150" w:type="dxa"/>
-              <w:right w:w="150" w:type="dxa"/>
-            </w:tcMar>
-          </w:tcPr>
-          <w:p>
-            <w:r>
-              <w:rPr>
-                <w:rFonts w:ascii="Calibri" w:hAnsi="Calibri"/>
-                <w:color w:val="334155"/>
-                <w:sz w:val="19"/>
-              </w:rPr>
-              <w:t>user (Cascade)</w:t>
-            </w:r>
-          </w:p>
-        </w:tc>
-      </w:tr>
-      <w:tr>
-        <w:tc>
-          <w:tcPr>
-            <w:tcW w:type="dxa" w:w="2160"/>
-            <w:shd w:fill="F8FAFC"/>
-            <w:tcMar>
-              <w:top w:w="100" w:type="dxa"/>
-              <w:bottom w:w="100" w:type="dxa"/>
-              <w:left w:w="150" w:type="dxa"/>
-              <w:right w:w="150" w:type="dxa"/>
-            </w:tcMar>
-          </w:tcPr>
-          <w:p>
-            <w:r>
-              <w:rPr>
-                <w:rFonts w:ascii="Calibri" w:hAnsi="Calibri"/>
-                <w:color w:val="334155"/>
-                <w:sz w:val="19"/>
-              </w:rPr>
-              <w:t>OTPCode</w:t>
-            </w:r>
-          </w:p>
-        </w:tc>
-        <w:tc>
-          <w:tcPr>
-            <w:tcW w:type="dxa" w:w="2160"/>
-            <w:shd w:fill="F8FAFC"/>
-            <w:tcMar>
-              <w:top w:w="100" w:type="dxa"/>
-              <w:bottom w:w="100" w:type="dxa"/>
-              <w:left w:w="150" w:type="dxa"/>
-              <w:right w:w="150" w:type="dxa"/>
-            </w:tcMar>
-          </w:tcPr>
-          <w:p>
-            <w:r>
-              <w:rPr>
-                <w:rFonts w:ascii="Calibri" w:hAnsi="Calibri"/>
-                <w:color w:val="334155"/>
-                <w:sz w:val="19"/>
-              </w:rPr>
-              <w:t>id (cuid)</w:t>
-            </w:r>
-          </w:p>
-        </w:tc>
-        <w:tc>
-          <w:tcPr>
-            <w:tcW w:type="dxa" w:w="3168"/>
-            <w:shd w:fill="F8FAFC"/>
-            <w:tcMar>
-              <w:top w:w="100" w:type="dxa"/>
-              <w:bottom w:w="100" w:type="dxa"/>
-              <w:left w:w="150" w:type="dxa"/>
-              <w:right w:w="150" w:type="dxa"/>
-            </w:tcMar>
-          </w:tcPr>
-          <w:p>
-            <w:r>
-              <w:rPr>
-                <w:rFonts w:ascii="Calibri" w:hAnsi="Calibri"/>
-                <w:color w:val="334155"/>
-                <w:sz w:val="19"/>
-              </w:rPr>
-              <w:t>email, codeHash, attempts, verified, isDemo, expiresAt</w:t>
-            </w:r>
-          </w:p>
-        </w:tc>
-        <w:tc>
-          <w:tcPr>
-            <w:tcW w:type="dxa" w:w="1872"/>
-            <w:shd w:fill="F8FAFC"/>
-            <w:tcMar>
-              <w:top w:w="100" w:type="dxa"/>
-              <w:bottom w:w="100" w:type="dxa"/>
-              <w:left w:w="150" w:type="dxa"/>
-              <w:right w:w="150" w:type="dxa"/>
-            </w:tcMar>
-          </w:tcPr>
-          <w:p>
-            <w:r>
-              <w:rPr>
-                <w:rFonts w:ascii="Calibri" w:hAnsi="Calibri"/>
-                <w:color w:val="334155"/>
-                <w:sz w:val="19"/>
-              </w:rPr>
-              <w:t>user (Optional)</w:t>
-            </w:r>
-          </w:p>
-        </w:tc>
-      </w:tr>
-      <w:tr>
-        <w:tc>
-          <w:tcPr>
-            <w:tcW w:type="dxa" w:w="2160"/>
-            <w:shd w:fill="FFFFFF"/>
-            <w:tcMar>
-              <w:top w:w="100" w:type="dxa"/>
-              <w:bottom w:w="100" w:type="dxa"/>
-              <w:left w:w="150" w:type="dxa"/>
-              <w:right w:w="150" w:type="dxa"/>
-            </w:tcMar>
-          </w:tcPr>
-          <w:p>
-            <w:r>
-              <w:rPr>
-                <w:rFonts w:ascii="Calibri" w:hAnsi="Calibri"/>
-                <w:color w:val="334155"/>
-                <w:sz w:val="19"/>
-              </w:rPr>
-              <w:t>QRLoginRequest</w:t>
-            </w:r>
-          </w:p>
-        </w:tc>
-        <w:tc>
-          <w:tcPr>
-            <w:tcW w:type="dxa" w:w="2160"/>
-            <w:shd w:fill="FFFFFF"/>
-            <w:tcMar>
-              <w:top w:w="100" w:type="dxa"/>
-              <w:bottom w:w="100" w:type="dxa"/>
-              <w:left w:w="150" w:type="dxa"/>
-              <w:right w:w="150" w:type="dxa"/>
-            </w:tcMar>
-          </w:tcPr>
-          <w:p>
-            <w:r>
-              <w:rPr>
-                <w:rFonts w:ascii="Calibri" w:hAnsi="Calibri"/>
-                <w:color w:val="334155"/>
-                <w:sz w:val="19"/>
-              </w:rPr>
-              <w:t>id (cuid)</w:t>
-            </w:r>
-          </w:p>
-        </w:tc>
-        <w:tc>
-          <w:tcPr>
-            <w:tcW w:type="dxa" w:w="3168"/>
-            <w:shd w:fill="FFFFFF"/>
-            <w:tcMar>
-              <w:top w:w="100" w:type="dxa"/>
-              <w:bottom w:w="100" w:type="dxa"/>
-              <w:left w:w="150" w:type="dxa"/>
-              <w:right w:w="150" w:type="dxa"/>
-            </w:tcMar>
-          </w:tcPr>
-          <w:p>
-            <w:r>
-              <w:rPr>
-                <w:rFonts w:ascii="Calibri" w:hAnsi="Calibri"/>
-                <w:color w:val="334155"/>
-                <w:sz w:val="19"/>
-              </w:rPr>
-              <w:t>requestId, status, deviceInfo, ipAddress, sessionToken, isDemo, expiresAt</w:t>
-            </w:r>
-          </w:p>
-        </w:tc>
-        <w:tc>
-          <w:tcPr>
-            <w:tcW w:type="dxa" w:w="1872"/>
-            <w:shd w:fill="FFFFFF"/>
-            <w:tcMar>
-              <w:top w:w="100" w:type="dxa"/>
-              <w:bottom w:w="100" w:type="dxa"/>
-              <w:left w:w="150" w:type="dxa"/>
-              <w:right w:w="150" w:type="dxa"/>
-            </w:tcMar>
-          </w:tcPr>
-          <w:p>
-            <w:r>
-              <w:rPr>
-                <w:rFonts w:ascii="Calibri" w:hAnsi="Calibri"/>
-                <w:color w:val="334155"/>
-                <w:sz w:val="19"/>
-              </w:rPr>
-              <w:t>user (Optional)</w:t>
-            </w:r>
-          </w:p>
-        </w:tc>
-      </w:tr>
-      <w:tr>
-        <w:tc>
-          <w:tcPr>
-            <w:tcW w:type="dxa" w:w="2160"/>
-            <w:shd w:fill="F8FAFC"/>
-            <w:tcMar>
-              <w:top w:w="100" w:type="dxa"/>
-              <w:bottom w:w="100" w:type="dxa"/>
-              <w:left w:w="150" w:type="dxa"/>
-              <w:right w:w="150" w:type="dxa"/>
-            </w:tcMar>
-          </w:tcPr>
-          <w:p>
-            <w:r>
-              <w:rPr>
-                <w:rFonts w:ascii="Calibri" w:hAnsi="Calibri"/>
-                <w:color w:val="334155"/>
-                <w:sz w:val="19"/>
-              </w:rPr>
-              <w:t>TrustedDevice</w:t>
-            </w:r>
-          </w:p>
-        </w:tc>
-        <w:tc>
-          <w:tcPr>
-            <w:tcW w:type="dxa" w:w="2160"/>
-            <w:shd w:fill="F8FAFC"/>
-            <w:tcMar>
-              <w:top w:w="100" w:type="dxa"/>
-              <w:bottom w:w="100" w:type="dxa"/>
-              <w:left w:w="150" w:type="dxa"/>
-              <w:right w:w="150" w:type="dxa"/>
-            </w:tcMar>
-          </w:tcPr>
-          <w:p>
-            <w:r>
-              <w:rPr>
-                <w:rFonts w:ascii="Calibri" w:hAnsi="Calibri"/>
-                <w:color w:val="334155"/>
-                <w:sz w:val="19"/>
-              </w:rPr>
-              <w:t>id (cuid)</w:t>
-            </w:r>
-          </w:p>
-        </w:tc>
-        <w:tc>
-          <w:tcPr>
-            <w:tcW w:type="dxa" w:w="3168"/>
-            <w:shd w:fill="F8FAFC"/>
-            <w:tcMar>
-              <w:top w:w="100" w:type="dxa"/>
-              <w:bottom w:w="100" w:type="dxa"/>
-              <w:left w:w="150" w:type="dxa"/>
-              <w:right w:w="150" w:type="dxa"/>
-            </w:tcMar>
-          </w:tcPr>
-          <w:p>
-            <w:r>
-              <w:rPr>
-                <w:rFonts w:ascii="Calibri" w:hAnsi="Calibri"/>
-                <w:color w:val="334155"/>
-                <w:sz w:val="19"/>
-              </w:rPr>
-              <w:t>deviceName, browser, deviceFingerprint, location, status, isDemo, lastActive</w:t>
-            </w:r>
-          </w:p>
-        </w:tc>
-        <w:tc>
-          <w:tcPr>
-            <w:tcW w:type="dxa" w:w="1872"/>
-            <w:shd w:fill="F8FAFC"/>
-            <w:tcMar>
-              <w:top w:w="100" w:type="dxa"/>
-              <w:bottom w:w="100" w:type="dxa"/>
-              <w:left w:w="150" w:type="dxa"/>
-              <w:right w:w="150" w:type="dxa"/>
-            </w:tcMar>
-          </w:tcPr>
-          <w:p>
-            <w:r>
-              <w:rPr>
-                <w:rFonts w:ascii="Calibri" w:hAnsi="Calibri"/>
-                <w:color w:val="334155"/>
-                <w:sz w:val="19"/>
-              </w:rPr>
-              <w:t>user (Cascade)</w:t>
-            </w:r>
-          </w:p>
-        </w:tc>
-      </w:tr>
-      <w:tr>
-        <w:tc>
-          <w:tcPr>
-            <w:tcW w:type="dxa" w:w="2160"/>
-            <w:shd w:fill="FFFFFF"/>
-            <w:tcMar>
-              <w:top w:w="100" w:type="dxa"/>
-              <w:bottom w:w="100" w:type="dxa"/>
-              <w:left w:w="150" w:type="dxa"/>
-              <w:right w:w="150" w:type="dxa"/>
-            </w:tcMar>
-          </w:tcPr>
-          <w:p>
-            <w:r>
-              <w:rPr>
-                <w:rFonts w:ascii="Calibri" w:hAnsi="Calibri"/>
-                <w:color w:val="334155"/>
-                <w:sz w:val="19"/>
-              </w:rPr>
-              <w:t>LoginHistory</w:t>
-            </w:r>
-          </w:p>
-        </w:tc>
-        <w:tc>
-          <w:tcPr>
-            <w:tcW w:type="dxa" w:w="2160"/>
-            <w:shd w:fill="FFFFFF"/>
-            <w:tcMar>
-              <w:top w:w="100" w:type="dxa"/>
-              <w:bottom w:w="100" w:type="dxa"/>
-              <w:left w:w="150" w:type="dxa"/>
-              <w:right w:w="150" w:type="dxa"/>
-            </w:tcMar>
-          </w:tcPr>
-          <w:p>
-            <w:r>
-              <w:rPr>
-                <w:rFonts w:ascii="Calibri" w:hAnsi="Calibri"/>
-                <w:color w:val="334155"/>
-                <w:sz w:val="19"/>
-              </w:rPr>
-              <w:t>id (cuid)</w:t>
-            </w:r>
-          </w:p>
-        </w:tc>
-        <w:tc>
-          <w:tcPr>
-            <w:tcW w:type="dxa" w:w="3168"/>
-            <w:shd w:fill="FFFFFF"/>
-            <w:tcMar>
-              <w:top w:w="100" w:type="dxa"/>
-              <w:bottom w:w="100" w:type="dxa"/>
-              <w:left w:w="150" w:type="dxa"/>
-              <w:right w:w="150" w:type="dxa"/>
-            </w:tcMar>
-          </w:tcPr>
-          <w:p>
-            <w:r>
-              <w:rPr>
-                <w:rFonts w:ascii="Calibri" w:hAnsi="Calibri"/>
-                <w:color w:val="334155"/>
-                <w:sz w:val="19"/>
-              </w:rPr>
-              <w:t>method, device, browser, status, riskLevel, ipAddress, location, deviceId, isDemo</w:t>
-            </w:r>
-          </w:p>
-        </w:tc>
-        <w:tc>
-          <w:tcPr>
-            <w:tcW w:type="dxa" w:w="1872"/>
-            <w:shd w:fill="FFFFFF"/>
-            <w:tcMar>
-              <w:top w:w="100" w:type="dxa"/>
-              <w:bottom w:w="100" w:type="dxa"/>
-              <w:left w:w="150" w:type="dxa"/>
-              <w:right w:w="150" w:type="dxa"/>
-            </w:tcMar>
-          </w:tcPr>
-          <w:p>
-            <w:r>
-              <w:rPr>
-                <w:rFonts w:ascii="Calibri" w:hAnsi="Calibri"/>
-                <w:color w:val="334155"/>
-                <w:sz w:val="19"/>
-              </w:rPr>
-              <w:t>user (Cascade)</w:t>
-            </w:r>
-          </w:p>
-        </w:tc>
-      </w:tr>
-      <w:tr>
-        <w:tc>
-          <w:tcPr>
-            <w:tcW w:type="dxa" w:w="2160"/>
-            <w:shd w:fill="F8FAFC"/>
-            <w:tcMar>
-              <w:top w:w="100" w:type="dxa"/>
-              <w:bottom w:w="100" w:type="dxa"/>
-              <w:left w:w="150" w:type="dxa"/>
-              <w:right w:w="150" w:type="dxa"/>
-            </w:tcMar>
-          </w:tcPr>
-          <w:p>
-            <w:r>
-              <w:rPr>
-                <w:rFonts w:ascii="Calibri" w:hAnsi="Calibri"/>
-                <w:color w:val="334155"/>
-                <w:sz w:val="19"/>
-              </w:rPr>
-              <w:t>RiskAssessment</w:t>
-            </w:r>
-          </w:p>
-        </w:tc>
-        <w:tc>
-          <w:tcPr>
-            <w:tcW w:type="dxa" w:w="2160"/>
-            <w:shd w:fill="F8FAFC"/>
-            <w:tcMar>
-              <w:top w:w="100" w:type="dxa"/>
-              <w:bottom w:w="100" w:type="dxa"/>
-              <w:left w:w="150" w:type="dxa"/>
-              <w:right w:w="150" w:type="dxa"/>
-            </w:tcMar>
-          </w:tcPr>
-          <w:p>
-            <w:r>
-              <w:rPr>
-                <w:rFonts w:ascii="Calibri" w:hAnsi="Calibri"/>
-                <w:color w:val="334155"/>
-                <w:sz w:val="19"/>
-              </w:rPr>
-              <w:t>id (cuid)</w:t>
-            </w:r>
-          </w:p>
-        </w:tc>
-        <w:tc>
-          <w:tcPr>
-            <w:tcW w:type="dxa" w:w="3168"/>
-            <w:shd w:fill="F8FAFC"/>
-            <w:tcMar>
-              <w:top w:w="100" w:type="dxa"/>
-              <w:bottom w:w="100" w:type="dxa"/>
-              <w:left w:w="150" w:type="dxa"/>
-              <w:right w:w="150" w:type="dxa"/>
-            </w:tcMar>
-          </w:tcPr>
-          <w:p>
-            <w:r>
-              <w:rPr>
-                <w:rFonts w:ascii="Calibri" w:hAnsi="Calibri"/>
-                <w:color w:val="334155"/>
-                <w:sz w:val="19"/>
-              </w:rPr>
-              <w:t>score, level, reasons (JSON), ipAddress</w:t>
-            </w:r>
-          </w:p>
-        </w:tc>
-        <w:tc>
-          <w:tcPr>
-            <w:tcW w:type="dxa" w:w="1872"/>
-            <w:shd w:fill="F8FAFC"/>
-            <w:tcMar>
-              <w:top w:w="100" w:type="dxa"/>
-              <w:bottom w:w="100" w:type="dxa"/>
-              <w:left w:w="150" w:type="dxa"/>
-              <w:right w:w="150" w:type="dxa"/>
-            </w:tcMar>
-          </w:tcPr>
-          <w:p>
-            <w:r>
-              <w:rPr>
-                <w:rFonts w:ascii="Calibri" w:hAnsi="Calibri"/>
-                <w:color w:val="334155"/>
-                <w:sz w:val="19"/>
-              </w:rPr>
-              <w:t>user (Cascade)</w:t>
-            </w:r>
-          </w:p>
-        </w:tc>
-      </w:tr>
-      <w:tr>
-        <w:tc>
-          <w:tcPr>
-            <w:tcW w:type="dxa" w:w="2160"/>
-            <w:shd w:fill="FFFFFF"/>
-            <w:tcMar>
-              <w:top w:w="100" w:type="dxa"/>
-              <w:bottom w:w="100" w:type="dxa"/>
-              <w:left w:w="150" w:type="dxa"/>
-              <w:right w:w="150" w:type="dxa"/>
-            </w:tcMar>
-          </w:tcPr>
-          <w:p>
-            <w:r>
-              <w:rPr>
-                <w:rFonts w:ascii="Calibri" w:hAnsi="Calibri"/>
-                <w:color w:val="334155"/>
-                <w:sz w:val="19"/>
-              </w:rPr>
-              <w:t>UserSettings</w:t>
-            </w:r>
-          </w:p>
-        </w:tc>
-        <w:tc>
-          <w:tcPr>
-            <w:tcW w:type="dxa" w:w="2160"/>
-            <w:shd w:fill="FFFFFF"/>
-            <w:tcMar>
-              <w:top w:w="100" w:type="dxa"/>
-              <w:bottom w:w="100" w:type="dxa"/>
-              <w:left w:w="150" w:type="dxa"/>
-              <w:right w:w="150" w:type="dxa"/>
-            </w:tcMar>
-          </w:tcPr>
-          <w:p>
-            <w:r>
-              <w:rPr>
-                <w:rFonts w:ascii="Calibri" w:hAnsi="Calibri"/>
-                <w:color w:val="334155"/>
-                <w:sz w:val="19"/>
-              </w:rPr>
-              <w:t>id (cuid)</w:t>
-            </w:r>
-          </w:p>
-        </w:tc>
-        <w:tc>
-          <w:tcPr>
-            <w:tcW w:type="dxa" w:w="3168"/>
-            <w:shd w:fill="FFFFFF"/>
-            <w:tcMar>
-              <w:top w:w="100" w:type="dxa"/>
-              <w:bottom w:w="100" w:type="dxa"/>
-              <w:left w:w="150" w:type="dxa"/>
-              <w:right w:w="150" w:type="dxa"/>
-            </w:tcMar>
-          </w:tcPr>
-          <w:p>
-            <w:r>
-              <w:rPr>
-                <w:rFonts w:ascii="Calibri" w:hAnsi="Calibri"/>
-                <w:color w:val="334155"/>
-                <w:sz w:val="19"/>
-              </w:rPr>
-              <w:t>theme, deviceLimit, sessionTimeout, qrExpiry, qrDisabled, passkeysDisabled</w:t>
-            </w:r>
-          </w:p>
-        </w:tc>
-        <w:tc>
-          <w:tcPr>
-            <w:tcW w:type="dxa" w:w="1872"/>
-            <w:shd w:fill="FFFFFF"/>
-            <w:tcMar>
-              <w:top w:w="100" w:type="dxa"/>
-              <w:bottom w:w="100" w:type="dxa"/>
-              <w:left w:w="150" w:type="dxa"/>
-              <w:right w:w="150" w:type="dxa"/>
-            </w:tcMar>
-          </w:tcPr>
-          <w:p>
-            <w:r>
-              <w:rPr>
-                <w:rFonts w:ascii="Calibri" w:hAnsi="Calibri"/>
-                <w:color w:val="334155"/>
-                <w:sz w:val="19"/>
-              </w:rPr>
-              <w:t>user (Unique)</w:t>
-            </w:r>
-          </w:p>
-        </w:tc>
-      </w:tr>
-    </w:tbl>
-    <w:p>
-      <w:pPr>
-        <w:spacing w:after="240"/>
-      </w:pPr>
-    </w:p>
-    <w:p>
-      <w:pPr>
-        <w:keepNext/>
-        <w:spacing w:before="360" w:after="160"/>
-      </w:pPr>
-      <w:r>
-        <w:rPr>
-          <w:rFonts w:ascii="Calibri" w:hAnsi="Calibri"/>
-          <w:b/>
-          <w:color w:val="0F172A"/>
-          <w:sz w:val="36"/>
-        </w:rPr>
-        <w:t>4. End-to-End Data Flow Architectures</w:t>
-      </w:r>
-    </w:p>
-    <w:p>
-      <w:pPr>
-        <w:keepNext/>
-        <w:spacing w:before="280" w:after="120"/>
-      </w:pPr>
-      <w:r>
-        <w:rPr>
-          <w:rFonts w:ascii="Calibri" w:hAnsi="Calibri"/>
-          <w:b/>
-          <w:color w:val="2563EB"/>
-          <w:sz w:val="28"/>
-        </w:rPr>
-        <w:t>4.1 Flow 1: Email OTP Login &amp; Session Creation Flow</w:t>
-      </w:r>
-    </w:p>
-    <w:p>
-      <w:pPr>
-        <w:spacing w:before="0" w:after="120" w:line="276" w:lineRule="auto"/>
-      </w:pPr>
-      <w:r>
-        <w:rPr>
-          <w:rFonts w:ascii="Calibri" w:hAnsi="Calibri"/>
-          <w:b/>
-          <w:color w:val="1E293B"/>
-          <w:sz w:val="22"/>
-        </w:rPr>
-        <w:t xml:space="preserve">Step-by-Step Flow: </w:t>
-      </w:r>
-      <w:r>
-        <w:rPr>
-          <w:rFonts w:ascii="Calibri" w:hAnsi="Calibri"/>
-          <w:color w:val="334155"/>
-          <w:sz w:val="22"/>
-        </w:rPr>
-        <w:t>1. User submits email address on AuthPage.</w:t>
-        <w:br/>
-        <w:t>2. Client invokes generateOTP(email) -&gt; POST /api/auth/otp/generate.</w:t>
-        <w:br/>
-        <w:t>3. Server generates 6-digit code, stores SHA-256 hash in OTPCode table, sends email via Resend API (or returns code for toast if isDemo=true).</w:t>
-        <w:br/>
-        <w:t>4. User enters 6-digit code -&gt; POST /api/auth/otp/verify.</w:t>
-        <w:br/>
-        <w:t>5. Server verifies code hash, enforces expiry/attempts, marks OTP verified.</w:t>
-        <w:br/>
-        <w:t>6. Client resolves user record -&gt; POST /api/auth/session.</w:t>
-        <w:br/>
-        <w:t>7. Server parses User-Agent &amp; IP into device metadata, deletes old sessions for same device, creates active Session row in SQLite, returns token.</w:t>
-        <w:br/>
-        <w:t>8. Client saves sessionToken in storage, updates useAuth state, and redirects to Dashboard.</w:t>
-      </w:r>
-    </w:p>
-    <w:p>
-      <w:pPr>
-        <w:keepNext/>
-        <w:spacing w:before="280" w:after="120"/>
-      </w:pPr>
-      <w:r>
-        <w:rPr>
-          <w:rFonts w:ascii="Calibri" w:hAnsi="Calibri"/>
-          <w:b/>
-          <w:color w:val="2563EB"/>
-          <w:sz w:val="28"/>
-        </w:rPr>
-        <w:t>4.2 Flow 2: QR Code Cross-Device Authentication Flow</w:t>
-      </w:r>
-    </w:p>
-    <w:p>
-      <w:pPr>
-        <w:spacing w:before="0" w:after="120" w:line="276" w:lineRule="auto"/>
-      </w:pPr>
-      <w:r>
-        <w:rPr>
-          <w:rFonts w:ascii="Calibri" w:hAnsi="Calibri"/>
-          <w:b/>
-          <w:color w:val="1E293B"/>
-          <w:sz w:val="22"/>
-        </w:rPr>
-        <w:t xml:space="preserve">Step-by-Step Flow: </w:t>
-      </w:r>
-      <w:r>
-        <w:rPr>
-          <w:rFonts w:ascii="Calibri" w:hAnsi="Calibri"/>
-          <w:color w:val="334155"/>
-          <w:sz w:val="22"/>
-        </w:rPr>
-        <w:t>1. Desktop user selects QR Login method -&gt; POST /api/auth/qr/generate.</w:t>
-        <w:br/>
-        <w:t>2. Server creates QRLoginRequest with unique requestId and 60s expiry; desktop displays dynamic QR code.</w:t>
-        <w:br/>
-        <w:t>3. Desktop initiates polling interval to GET /api/auth/qr/status?requestId=...</w:t>
-        <w:br/>
-        <w:t>4. Mobile user opens mobile camera / scanner -&gt; scans QR code.</w:t>
-        <w:br/>
-        <w:t>5. Mobile app sends POST /api/auth/qr/approve with requestId, action ('approve'), and mobile user info.</w:t>
-        <w:br/>
-        <w:t>6. Server verifies mobile session, mints new Desktop Session record, updates QRLoginRequest status to 'approved' with sessionToken.</w:t>
-        <w:br/>
-        <w:t>7. Desktop polling receives status 'approved' and sessionToken, saves session in client storage, and redirects to Dashboard.</w:t>
-      </w:r>
-    </w:p>
-    <w:p>
-      <w:pPr>
-        <w:keepNext/>
-        <w:spacing w:before="280" w:after="120"/>
-      </w:pPr>
-      <w:r>
-        <w:rPr>
-          <w:rFonts w:ascii="Calibri" w:hAnsi="Calibri"/>
-          <w:b/>
-          <w:color w:val="2563EB"/>
-          <w:sz w:val="28"/>
-        </w:rPr>
-        <w:t>4.3 Flow 3: New Device Detection &amp; Risk Engine Evaluation Flow</w:t>
-      </w:r>
-    </w:p>
-    <w:p>
-      <w:pPr>
-        <w:spacing w:before="0" w:after="120" w:line="276" w:lineRule="auto"/>
-      </w:pPr>
-      <w:r>
-        <w:rPr>
-          <w:rFonts w:ascii="Calibri" w:hAnsi="Calibri"/>
-          <w:b/>
-          <w:color w:val="1E293B"/>
-          <w:sz w:val="22"/>
-        </w:rPr>
-        <w:t xml:space="preserve">Step-by-Step Flow: </w:t>
-      </w:r>
-      <w:r>
-        <w:rPr>
-          <w:rFonts w:ascii="Calibri" w:hAnsi="Calibri"/>
-          <w:color w:val="334155"/>
-          <w:sz w:val="22"/>
-        </w:rPr>
-        <w:t>1. User logs in from a new browser or device.</w:t>
-        <w:br/>
-        <w:t>2. Backend extracts User-Agent &amp; IP, generating deviceFingerprint (e.g. dev_fp_windows_laptop).</w:t>
-        <w:br/>
-        <w:t>3. Risk engine queries TrustedDevice table for userId + deviceFingerprint match.</w:t>
-        <w:br/>
-        <w:t>4. If no match found: Risk Engine calculates risk score (+30 new device, +20 location difference) -&gt; returns Medium/High Risk.</w:t>
-        <w:br/>
-        <w:t>5. Frontend renders NewDeviceModal warning.</w:t>
-        <w:br/>
-        <w:t>6. If user clicks 'Yes, it's me': POST /api/auth/devices/trust registers device as trusted and reduces risk score to Low (10/100).</w:t>
-        <w:br/>
-        <w:t>7. If user clicks 'No, it's not me': DELETE /api/auth/devices/trust revokes all non-current sessions, logs High Risk security alert, and logs out untrusted device.</w:t>
-      </w:r>
-    </w:p>
-    <w:p>
-      <w:pPr>
-        <w:keepNext/>
-        <w:spacing w:before="280" w:after="120"/>
-      </w:pPr>
-      <w:r>
-        <w:rPr>
-          <w:rFonts w:ascii="Calibri" w:hAnsi="Calibri"/>
-          <w:b/>
-          <w:color w:val="2563EB"/>
-          <w:sz w:val="28"/>
-        </w:rPr>
-        <w:t>4.4 Flow 4: Session Management &amp; Revocation Flow</w:t>
-      </w:r>
-    </w:p>
-    <w:p>
-      <w:pPr>
-        <w:spacing w:before="0" w:after="120" w:line="276" w:lineRule="auto"/>
-      </w:pPr>
-      <w:r>
-        <w:rPr>
-          <w:rFonts w:ascii="Calibri" w:hAnsi="Calibri"/>
-          <w:b/>
-          <w:color w:val="1E293B"/>
-          <w:sz w:val="22"/>
-        </w:rPr>
-        <w:t xml:space="preserve">Step-by-Step Flow: </w:t>
-      </w:r>
-      <w:r>
-        <w:rPr>
-          <w:rFonts w:ascii="Calibri" w:hAnsi="Calibri"/>
-          <w:color w:val="334155"/>
-          <w:sz w:val="22"/>
-        </w:rPr>
-        <w:t>1. Dashboard fetches active sessions via GET /api/auth/sessions?userId=...&amp;currentToken=...</w:t>
-        <w:br/>
-        <w:t>2. Server cleans up expired sessions, deduplicates physical device sessions by deviceFingerprint, and returns session list + summary counters.</w:t>
-        <w:br/>
-        <w:t>3. UI renders Session Cards with Device Icon, OS/Browser, Status Badge (Active/Idle/Expired/Revoked), Duration, Location, Masked IP, and 'View Details' button.</w:t>
-        <w:br/>
-        <w:t>4. Current device renders 'This Device' badge; secondary devices render 'Logout Session' button.</w:t>
-        <w:br/>
-        <w:t>5. User clicks 'Logout Session' -&gt; DELETE /api/auth/sessions with sessionId.</w:t>
-        <w:br/>
-        <w:t>6. Server deletes target session token from SQLite, invalidates access, and records LoginHistory audit log.</w:t>
-        <w:br/>
-        <w:t>7. User clicks 'Logout All Other Devices' -&gt; DELETE /api/auth/sessions with action='revoke_others'. Server revokes all sessions except current active token.</w:t>
-      </w:r>
-    </w:p>
-    <w:p>
-      <w:pPr>
-        <w:keepNext/>
-        <w:spacing w:before="360" w:after="160"/>
-      </w:pPr>
-      <w:r>
-        <w:rPr>
-          <w:rFonts w:ascii="Calibri" w:hAnsi="Calibri"/>
-          <w:b/>
-          <w:color w:val="0F172A"/>
-          <w:sz w:val="36"/>
-        </w:rPr>
-        <w:t>5. Verification, File Structure &amp; System Paths</w:t>
-      </w:r>
-    </w:p>
-    <w:p>
-      <w:pPr>
-        <w:spacing w:before="0" w:after="120" w:line="276" w:lineRule="auto"/>
-      </w:pPr>
-      <w:r>
-        <w:rPr>
-          <w:rFonts w:ascii="Calibri" w:hAnsi="Calibri"/>
-          <w:b/>
-          <w:color w:val="1E293B"/>
-          <w:sz w:val="22"/>
-        </w:rPr>
-        <w:t xml:space="preserve">Local Storage Path: </w:t>
-      </w:r>
-      <w:r>
-        <w:rPr>
-          <w:rFonts w:ascii="Calibri" w:hAnsi="Calibri"/>
-          <w:color w:val="334155"/>
-          <w:sz w:val="22"/>
-        </w:rPr>
-        <w:t>The AuthX codebase is located in the local workspace directory. All files are synchronized and verified.</w:t>
-      </w:r>
-    </w:p>
-    <w:tbl>
-      <w:tblPr>
-        <w:tblW w:type="auto" w:w="0"/>
-        <w:jc w:val="center"/>
-        <w:tblLook w:firstColumn="1" w:firstRow="1" w:lastColumn="0" w:lastRow="0" w:noHBand="0" w:noVBand="1" w:val="04A0"/>
-      </w:tblPr>
-      <w:tblGrid>
-        <w:gridCol w:w="9360"/>
-      </w:tblGrid>
-      <w:tr>
-        <w:tc>
-          <w:tcPr>
-            <w:tcW w:type="dxa" w:w="9360"/>
-            <w:shd w:fill="F1F5F9"/>
-            <w:tcMar>
-              <w:top w:w="140" w:type="dxa"/>
-              <w:bottom w:w="140" w:type="dxa"/>
-              <w:left w:w="200" w:type="dxa"/>
-              <w:right w:w="200" w:type="dxa"/>
-            </w:tcMar>
-            <w:tcBorders>
-              <w:top w:val="none"/>
-              <w:left w:val="single" w:sz="36" w:space="0" w:color="2563EB"/>
-              <w:bottom w:val="none"/>
-              <w:right w:val="none"/>
-            </w:tcBorders>
-          </w:tcPr>
-          <w:p>
-            <w:pPr>
-              <w:spacing w:before="0" w:after="40"/>
-            </w:pPr>
-            <w:r>
-              <w:rPr>
-                <w:rFonts w:ascii="Calibri" w:hAnsi="Calibri"/>
-                <w:b/>
-                <w:color w:val="2563EB"/>
-                <w:sz w:val="22"/>
-              </w:rPr>
-              <w:t>💡 System Storage Location</w:t>
-              <w:br/>
-            </w:r>
-            <w:r>
-              <w:rPr>
-                <w:rFonts w:ascii="Calibri" w:hAnsi="Calibri"/>
-                <w:color w:val="475569"/>
-                <w:sz w:val="20"/>
-              </w:rPr>
-              <w:t>Full Absolute Path: C:\Users\HP\.gemini\antigravity\scratch\AuthX\AuthX_Project_Documentation.docx</w:t>
-              <w:br/>
-              <w:t>Repository Commit: 6b100b1 (origin/main)</w:t>
-            </w:r>
-          </w:p>
-        </w:tc>
-      </w:tr>
-    </w:tbl>
-    <w:p>
-      <w:pPr>
-        <w:spacing w:after="80"/>
-      </w:pPr>
-    </w:p>
-    <w:p>
-      <w:pPr>
-        <w:keepNext/>
-        <w:spacing w:before="280" w:after="120"/>
-      </w:pPr>
-      <w:r>
-        <w:rPr>
-          <w:rFonts w:ascii="Calibri" w:hAnsi="Calibri"/>
-          <w:b/>
-          <w:color w:val="2563EB"/>
-          <w:sz w:val="28"/>
-        </w:rPr>
-        <w:t>5.1 Key Codebase File Locations</w:t>
-      </w:r>
-    </w:p>
-    <w:tbl>
-      <w:tblPr>
-        <w:tblW w:type="auto" w:w="0"/>
-        <w:jc w:val="center"/>
-        <w:tblLook w:firstColumn="1" w:firstRow="1" w:lastColumn="0" w:lastRow="0" w:noHBand="0" w:noVBand="1" w:val="04A0"/>
-      </w:tblPr>
-      <w:tblGrid>
-        <w:gridCol w:w="4680"/>
-        <w:gridCol w:w="4680"/>
-      </w:tblGrid>
-      <w:tr>
-        <w:tc>
-          <w:tcPr>
-            <w:tcW w:type="dxa" w:w="3600"/>
-            <w:shd w:fill="0F172A"/>
-            <w:tcMar>
-              <w:top w:w="120" w:type="dxa"/>
-              <w:bottom w:w="120" w:type="dxa"/>
-              <w:left w:w="150" w:type="dxa"/>
-              <w:right w:w="150" w:type="dxa"/>
-            </w:tcMar>
-          </w:tcPr>
-          <w:p>
-            <w:pPr>
-              <w:jc w:val="left"/>
-            </w:pPr>
-            <w:r>
-              <w:rPr>
-                <w:rFonts w:ascii="Calibri" w:hAnsi="Calibri"/>
-                <w:b/>
-                <w:color w:val="FFFFFF"/>
-                <w:sz w:val="20"/>
-              </w:rPr>
-              <w:t>Component / Module</w:t>
-            </w:r>
-          </w:p>
-        </w:tc>
-        <w:tc>
-          <w:tcPr>
-            <w:tcW w:type="dxa" w:w="5760"/>
-            <w:shd w:fill="0F172A"/>
-            <w:tcMar>
-              <w:top w:w="120" w:type="dxa"/>
-              <w:bottom w:w="120" w:type="dxa"/>
-              <w:left w:w="150" w:type="dxa"/>
-              <w:right w:w="150" w:type="dxa"/>
-            </w:tcMar>
-          </w:tcPr>
-          <w:p>
-            <w:pPr>
-              <w:jc w:val="left"/>
-            </w:pPr>
-            <w:r>
-              <w:rPr>
-                <w:rFonts w:ascii="Calibri" w:hAnsi="Calibri"/>
-                <w:b/>
-                <w:color w:val="FFFFFF"/>
-                <w:sz w:val="20"/>
-              </w:rPr>
-              <w:t>Relative File Path</w:t>
-            </w:r>
-          </w:p>
-        </w:tc>
-      </w:tr>
-      <w:tr>
-        <w:tc>
-          <w:tcPr>
-            <w:tcW w:type="dxa" w:w="3600"/>
-            <w:shd w:fill="FFFFFF"/>
-            <w:tcMar>
-              <w:top w:w="100" w:type="dxa"/>
-              <w:bottom w:w="100" w:type="dxa"/>
-              <w:left w:w="150" w:type="dxa"/>
-              <w:right w:w="150" w:type="dxa"/>
-            </w:tcMar>
-          </w:tcPr>
-          <w:p>
-            <w:r>
-              <w:rPr>
-                <w:rFonts w:ascii="Calibri" w:hAnsi="Calibri"/>
-                <w:color w:val="334155"/>
-                <w:sz w:val="19"/>
-              </w:rPr>
-              <w:t>Prisma Database Schema</w:t>
-            </w:r>
-          </w:p>
-        </w:tc>
-        <w:tc>
-          <w:tcPr>
-            <w:tcW w:type="dxa" w:w="5760"/>
-            <w:shd w:fill="FFFFFF"/>
-            <w:tcMar>
-              <w:top w:w="100" w:type="dxa"/>
-              <w:bottom w:w="100" w:type="dxa"/>
-              <w:left w:w="150" w:type="dxa"/>
-              <w:right w:w="150" w:type="dxa"/>
-            </w:tcMar>
-          </w:tcPr>
-          <w:p>
-            <w:r>
-              <w:rPr>
-                <w:rFonts w:ascii="Calibri" w:hAnsi="Calibri"/>
-                <w:color w:val="334155"/>
-                <w:sz w:val="19"/>
-              </w:rPr>
-              <w:t>prisma/schema.prisma</w:t>
-            </w:r>
-          </w:p>
-        </w:tc>
-      </w:tr>
-      <w:tr>
-        <w:tc>
-          <w:tcPr>
-            <w:tcW w:type="dxa" w:w="3600"/>
-            <w:shd w:fill="F8FAFC"/>
-            <w:tcMar>
-              <w:top w:w="100" w:type="dxa"/>
-              <w:bottom w:w="100" w:type="dxa"/>
-              <w:left w:w="150" w:type="dxa"/>
-              <w:right w:w="150" w:type="dxa"/>
-            </w:tcMar>
-          </w:tcPr>
-          <w:p>
-            <w:r>
-              <w:rPr>
-                <w:rFonts w:ascii="Calibri" w:hAnsi="Calibri"/>
-                <w:color w:val="334155"/>
-                <w:sz w:val="19"/>
-              </w:rPr>
-              <w:t>Landing Page</w:t>
-            </w:r>
-          </w:p>
-        </w:tc>
-        <w:tc>
-          <w:tcPr>
-            <w:tcW w:type="dxa" w:w="5760"/>
-            <w:shd w:fill="F8FAFC"/>
-            <w:tcMar>
-              <w:top w:w="100" w:type="dxa"/>
-              <w:bottom w:w="100" w:type="dxa"/>
-              <w:left w:w="150" w:type="dxa"/>
-              <w:right w:w="150" w:type="dxa"/>
-            </w:tcMar>
-          </w:tcPr>
-          <w:p>
-            <w:r>
-              <w:rPr>
-                <w:rFonts w:ascii="Calibri" w:hAnsi="Calibri"/>
-                <w:color w:val="334155"/>
-                <w:sz w:val="19"/>
-              </w:rPr>
-              <w:t>src/components/landing/LandingPage.tsx</w:t>
-            </w:r>
-          </w:p>
-        </w:tc>
-      </w:tr>
-      <w:tr>
-        <w:tc>
-          <w:tcPr>
-            <w:tcW w:type="dxa" w:w="3600"/>
-            <w:shd w:fill="FFFFFF"/>
-            <w:tcMar>
-              <w:top w:w="100" w:type="dxa"/>
-              <w:bottom w:w="100" w:type="dxa"/>
-              <w:left w:w="150" w:type="dxa"/>
-              <w:right w:w="150" w:type="dxa"/>
-            </w:tcMar>
-          </w:tcPr>
-          <w:p>
-            <w:r>
-              <w:rPr>
-                <w:rFonts w:ascii="Calibri" w:hAnsi="Calibri"/>
-                <w:color w:val="334155"/>
-                <w:sz w:val="19"/>
-              </w:rPr>
-              <w:t>Auth Page Container</w:t>
-            </w:r>
-          </w:p>
-        </w:tc>
-        <w:tc>
-          <w:tcPr>
-            <w:tcW w:type="dxa" w:w="5760"/>
-            <w:shd w:fill="FFFFFF"/>
-            <w:tcMar>
-              <w:top w:w="100" w:type="dxa"/>
-              <w:bottom w:w="100" w:type="dxa"/>
-              <w:left w:w="150" w:type="dxa"/>
-              <w:right w:w="150" w:type="dxa"/>
-            </w:tcMar>
-          </w:tcPr>
-          <w:p>
-            <w:r>
-              <w:rPr>
-                <w:rFonts w:ascii="Calibri" w:hAnsi="Calibri"/>
-                <w:color w:val="334155"/>
-                <w:sz w:val="19"/>
-              </w:rPr>
-              <w:t>src/components/auth/AuthPage.tsx</w:t>
-            </w:r>
-          </w:p>
-        </w:tc>
-      </w:tr>
-      <w:tr>
-        <w:tc>
-          <w:tcPr>
-            <w:tcW w:type="dxa" w:w="3600"/>
-            <w:shd w:fill="F8FAFC"/>
-            <w:tcMar>
-              <w:top w:w="100" w:type="dxa"/>
-              <w:bottom w:w="100" w:type="dxa"/>
-              <w:left w:w="150" w:type="dxa"/>
-              <w:right w:w="150" w:type="dxa"/>
-            </w:tcMar>
-          </w:tcPr>
-          <w:p>
-            <w:r>
-              <w:rPr>
-                <w:rFonts w:ascii="Calibri" w:hAnsi="Calibri"/>
-                <w:color w:val="334155"/>
-                <w:sz w:val="19"/>
-              </w:rPr>
-              <w:t>Email OTP Form</w:t>
-            </w:r>
-          </w:p>
-        </w:tc>
-        <w:tc>
-          <w:tcPr>
-            <w:tcW w:type="dxa" w:w="5760"/>
-            <w:shd w:fill="F8FAFC"/>
-            <w:tcMar>
-              <w:top w:w="100" w:type="dxa"/>
-              <w:bottom w:w="100" w:type="dxa"/>
-              <w:left w:w="150" w:type="dxa"/>
-              <w:right w:w="150" w:type="dxa"/>
-            </w:tcMar>
-          </w:tcPr>
-          <w:p>
-            <w:r>
-              <w:rPr>
-                <w:rFonts w:ascii="Calibri" w:hAnsi="Calibri"/>
-                <w:color w:val="334155"/>
-                <w:sz w:val="19"/>
-              </w:rPr>
-              <w:t>src/components/auth/OTPAuthForm.tsx</w:t>
-            </w:r>
-          </w:p>
-        </w:tc>
-      </w:tr>
-      <w:tr>
-        <w:tc>
-          <w:tcPr>
-            <w:tcW w:type="dxa" w:w="3600"/>
-            <w:shd w:fill="FFFFFF"/>
-            <w:tcMar>
-              <w:top w:w="100" w:type="dxa"/>
-              <w:bottom w:w="100" w:type="dxa"/>
-              <w:left w:w="150" w:type="dxa"/>
-              <w:right w:w="150" w:type="dxa"/>
-            </w:tcMar>
-          </w:tcPr>
-          <w:p>
-            <w:r>
-              <w:rPr>
-                <w:rFonts w:ascii="Calibri" w:hAnsi="Calibri"/>
-                <w:color w:val="334155"/>
-                <w:sz w:val="19"/>
-              </w:rPr>
-              <w:t>Passkey WebAuthn Form</w:t>
-            </w:r>
-          </w:p>
-        </w:tc>
-        <w:tc>
-          <w:tcPr>
-            <w:tcW w:type="dxa" w:w="5760"/>
-            <w:shd w:fill="FFFFFF"/>
-            <w:tcMar>
-              <w:top w:w="100" w:type="dxa"/>
-              <w:bottom w:w="100" w:type="dxa"/>
-              <w:left w:w="150" w:type="dxa"/>
-              <w:right w:w="150" w:type="dxa"/>
-            </w:tcMar>
-          </w:tcPr>
-          <w:p>
-            <w:r>
-              <w:rPr>
-                <w:rFonts w:ascii="Calibri" w:hAnsi="Calibri"/>
-                <w:color w:val="334155"/>
-                <w:sz w:val="19"/>
-              </w:rPr>
-              <w:t>src/components/auth/PasskeyAuthForm.tsx</w:t>
-            </w:r>
-          </w:p>
-        </w:tc>
-      </w:tr>
-      <w:tr>
-        <w:tc>
-          <w:tcPr>
-            <w:tcW w:type="dxa" w:w="3600"/>
-            <w:shd w:fill="F8FAFC"/>
-            <w:tcMar>
-              <w:top w:w="100" w:type="dxa"/>
-              <w:bottom w:w="100" w:type="dxa"/>
-              <w:left w:w="150" w:type="dxa"/>
-              <w:right w:w="150" w:type="dxa"/>
-            </w:tcMar>
-          </w:tcPr>
-          <w:p>
-            <w:r>
-              <w:rPr>
-                <w:rFonts w:ascii="Calibri" w:hAnsi="Calibri"/>
-                <w:color w:val="334155"/>
-                <w:sz w:val="19"/>
-              </w:rPr>
-              <w:t>QR Login Form</w:t>
-            </w:r>
-          </w:p>
-        </w:tc>
-        <w:tc>
-          <w:tcPr>
-            <w:tcW w:type="dxa" w:w="5760"/>
-            <w:shd w:fill="F8FAFC"/>
-            <w:tcMar>
-              <w:top w:w="100" w:type="dxa"/>
-              <w:bottom w:w="100" w:type="dxa"/>
-              <w:left w:w="150" w:type="dxa"/>
-              <w:right w:w="150" w:type="dxa"/>
-            </w:tcMar>
-          </w:tcPr>
-          <w:p>
-            <w:r>
-              <w:rPr>
-                <w:rFonts w:ascii="Calibri" w:hAnsi="Calibri"/>
-                <w:color w:val="334155"/>
-                <w:sz w:val="19"/>
-              </w:rPr>
-              <w:t>src/components/auth/QRAuthForm.tsx</w:t>
-            </w:r>
-          </w:p>
-        </w:tc>
-      </w:tr>
-      <w:tr>
-        <w:tc>
-          <w:tcPr>
-            <w:tcW w:type="dxa" w:w="3600"/>
-            <w:shd w:fill="FFFFFF"/>
-            <w:tcMar>
-              <w:top w:w="100" w:type="dxa"/>
-              <w:bottom w:w="100" w:type="dxa"/>
-              <w:left w:w="150" w:type="dxa"/>
-              <w:right w:w="150" w:type="dxa"/>
-            </w:tcMar>
-          </w:tcPr>
-          <w:p>
-            <w:r>
-              <w:rPr>
-                <w:rFonts w:ascii="Calibri" w:hAnsi="Calibri"/>
-                <w:color w:val="334155"/>
-                <w:sz w:val="19"/>
-              </w:rPr>
-              <w:t>Dashboard &amp; Sidebar</w:t>
-            </w:r>
-          </w:p>
-        </w:tc>
-        <w:tc>
-          <w:tcPr>
-            <w:tcW w:type="dxa" w:w="5760"/>
-            <w:shd w:fill="FFFFFF"/>
-            <w:tcMar>
-              <w:top w:w="100" w:type="dxa"/>
-              <w:bottom w:w="100" w:type="dxa"/>
-              <w:left w:w="150" w:type="dxa"/>
-              <w:right w:w="150" w:type="dxa"/>
-            </w:tcMar>
-          </w:tcPr>
-          <w:p>
-            <w:r>
-              <w:rPr>
-                <w:rFonts w:ascii="Calibri" w:hAnsi="Calibri"/>
-                <w:color w:val="334155"/>
-                <w:sz w:val="19"/>
-              </w:rPr>
-              <w:t>src/components/dashboard/Dashboard.tsx &amp; Sidebar.tsx</w:t>
-            </w:r>
-          </w:p>
-        </w:tc>
-      </w:tr>
-      <w:tr>
-        <w:tc>
-          <w:tcPr>
-            <w:tcW w:type="dxa" w:w="3600"/>
-            <w:shd w:fill="F8FAFC"/>
-            <w:tcMar>
-              <w:top w:w="100" w:type="dxa"/>
-              <w:bottom w:w="100" w:type="dxa"/>
-              <w:left w:w="150" w:type="dxa"/>
-              <w:right w:w="150" w:type="dxa"/>
-            </w:tcMar>
-          </w:tcPr>
-          <w:p>
-            <w:r>
-              <w:rPr>
-                <w:rFonts w:ascii="Calibri" w:hAnsi="Calibri"/>
-                <w:color w:val="334155"/>
-                <w:sz w:val="19"/>
-              </w:rPr>
-              <w:t>Dashboard Main View</w:t>
-            </w:r>
-          </w:p>
-        </w:tc>
-        <w:tc>
-          <w:tcPr>
-            <w:tcW w:type="dxa" w:w="5760"/>
-            <w:shd w:fill="F8FAFC"/>
-            <w:tcMar>
-              <w:top w:w="100" w:type="dxa"/>
-              <w:bottom w:w="100" w:type="dxa"/>
-              <w:left w:w="150" w:type="dxa"/>
-              <w:right w:w="150" w:type="dxa"/>
-            </w:tcMar>
-          </w:tcPr>
-          <w:p>
-            <w:r>
-              <w:rPr>
-                <w:rFonts w:ascii="Calibri" w:hAnsi="Calibri"/>
-                <w:color w:val="334155"/>
-                <w:sz w:val="19"/>
-              </w:rPr>
-              <w:t>src/components/dashboard/DashboardContent.tsx</w:t>
-            </w:r>
-          </w:p>
-        </w:tc>
-      </w:tr>
-      <w:tr>
-        <w:tc>
-          <w:tcPr>
-            <w:tcW w:type="dxa" w:w="3600"/>
-            <w:shd w:fill="FFFFFF"/>
-            <w:tcMar>
-              <w:top w:w="100" w:type="dxa"/>
-              <w:bottom w:w="100" w:type="dxa"/>
-              <w:left w:w="150" w:type="dxa"/>
-              <w:right w:w="150" w:type="dxa"/>
-            </w:tcMar>
-          </w:tcPr>
-          <w:p>
-            <w:r>
-              <w:rPr>
-                <w:rFonts w:ascii="Calibri" w:hAnsi="Calibri"/>
-                <w:color w:val="334155"/>
-                <w:sz w:val="19"/>
-              </w:rPr>
-              <w:t>Auth State Store (Zustand)</w:t>
-            </w:r>
-          </w:p>
-        </w:tc>
-        <w:tc>
-          <w:tcPr>
-            <w:tcW w:type="dxa" w:w="5760"/>
-            <w:shd w:fill="FFFFFF"/>
-            <w:tcMar>
-              <w:top w:w="100" w:type="dxa"/>
-              <w:bottom w:w="100" w:type="dxa"/>
-              <w:left w:w="150" w:type="dxa"/>
-              <w:right w:w="150" w:type="dxa"/>
-            </w:tcMar>
-          </w:tcPr>
-          <w:p>
-            <w:r>
-              <w:rPr>
-                <w:rFonts w:ascii="Calibri" w:hAnsi="Calibri"/>
-                <w:color w:val="334155"/>
-                <w:sz w:val="19"/>
-              </w:rPr>
-              <w:t>src/hooks/useAuth.ts</w:t>
-            </w:r>
-          </w:p>
-        </w:tc>
-      </w:tr>
-      <w:tr>
-        <w:tc>
-          <w:tcPr>
-            <w:tcW w:type="dxa" w:w="3600"/>
-            <w:shd w:fill="F8FAFC"/>
-            <w:tcMar>
-              <w:top w:w="100" w:type="dxa"/>
-              <w:bottom w:w="100" w:type="dxa"/>
-              <w:left w:w="150" w:type="dxa"/>
-              <w:right w:w="150" w:type="dxa"/>
-            </w:tcMar>
-          </w:tcPr>
-          <w:p>
-            <w:r>
-              <w:rPr>
-                <w:rFonts w:ascii="Calibri" w:hAnsi="Calibri"/>
-                <w:color w:val="334155"/>
-                <w:sz w:val="19"/>
-              </w:rPr>
-              <w:t>Auth Client API Service</w:t>
-            </w:r>
-          </w:p>
-        </w:tc>
-        <w:tc>
-          <w:tcPr>
-            <w:tcW w:type="dxa" w:w="5760"/>
-            <w:shd w:fill="F8FAFC"/>
-            <w:tcMar>
-              <w:top w:w="100" w:type="dxa"/>
-              <w:bottom w:w="100" w:type="dxa"/>
-              <w:left w:w="150" w:type="dxa"/>
-              <w:right w:w="150" w:type="dxa"/>
-            </w:tcMar>
-          </w:tcPr>
-          <w:p>
-            <w:r>
-              <w:rPr>
-                <w:rFonts w:ascii="Calibri" w:hAnsi="Calibri"/>
-                <w:color w:val="334155"/>
-                <w:sz w:val="19"/>
-              </w:rPr>
-              <w:t>src/services/auth-client.ts</w:t>
-            </w:r>
-          </w:p>
-        </w:tc>
-      </w:tr>
-      <w:tr>
-        <w:tc>
-          <w:tcPr>
-            <w:tcW w:type="dxa" w:w="3600"/>
-            <w:shd w:fill="FFFFFF"/>
-            <w:tcMar>
-              <w:top w:w="100" w:type="dxa"/>
-              <w:bottom w:w="100" w:type="dxa"/>
-              <w:left w:w="150" w:type="dxa"/>
-              <w:right w:w="150" w:type="dxa"/>
-            </w:tcMar>
-          </w:tcPr>
-          <w:p>
-            <w:r>
-              <w:rPr>
-                <w:rFonts w:ascii="Calibri" w:hAnsi="Calibri"/>
-                <w:color w:val="334155"/>
-                <w:sz w:val="19"/>
-              </w:rPr>
-              <w:t>Device Fingerprinting Utility</w:t>
-            </w:r>
-          </w:p>
-        </w:tc>
-        <w:tc>
-          <w:tcPr>
-            <w:tcW w:type="dxa" w:w="5760"/>
-            <w:shd w:fill="FFFFFF"/>
-            <w:tcMar>
-              <w:top w:w="100" w:type="dxa"/>
-              <w:bottom w:w="100" w:type="dxa"/>
-              <w:left w:w="150" w:type="dxa"/>
-              <w:right w:w="150" w:type="dxa"/>
-            </w:tcMar>
-          </w:tcPr>
-          <w:p>
-            <w:r>
-              <w:rPr>
-                <w:rFonts w:ascii="Calibri" w:hAnsi="Calibri"/>
-                <w:color w:val="334155"/>
-                <w:sz w:val="19"/>
-              </w:rPr>
-              <w:t>src/lib/device.ts</w:t>
-            </w:r>
-          </w:p>
-        </w:tc>
-      </w:tr>
-      <w:tr>
-        <w:tc>
-          <w:tcPr>
-            <w:tcW w:type="dxa" w:w="3600"/>
-            <w:shd w:fill="F8FAFC"/>
-            <w:tcMar>
-              <w:top w:w="100" w:type="dxa"/>
-              <w:bottom w:w="100" w:type="dxa"/>
-              <w:left w:w="150" w:type="dxa"/>
-              <w:right w:w="150" w:type="dxa"/>
-            </w:tcMar>
-          </w:tcPr>
-          <w:p>
-            <w:r>
-              <w:rPr>
-                <w:rFonts w:ascii="Calibri" w:hAnsi="Calibri"/>
-                <w:color w:val="334155"/>
-                <w:sz w:val="19"/>
-              </w:rPr>
-              <w:t>API Rate Limiter &amp; Helpers</w:t>
-            </w:r>
-          </w:p>
-        </w:tc>
-        <w:tc>
-          <w:tcPr>
-            <w:tcW w:type="dxa" w:w="5760"/>
-            <w:shd w:fill="F8FAFC"/>
-            <w:tcMar>
-              <w:top w:w="100" w:type="dxa"/>
-              <w:bottom w:w="100" w:type="dxa"/>
-              <w:left w:w="150" w:type="dxa"/>
-              <w:right w:w="150" w:type="dxa"/>
-            </w:tcMar>
-          </w:tcPr>
-          <w:p>
-            <w:r>
-              <w:rPr>
-                <w:rFonts w:ascii="Calibri" w:hAnsi="Calibri"/>
-                <w:color w:val="334155"/>
-                <w:sz w:val="19"/>
-              </w:rPr>
-              <w:t>src/lib/auth-api.ts &amp; rate-limit.ts</w:t>
-            </w:r>
-          </w:p>
-        </w:tc>
-      </w:tr>
-      <w:tr>
-        <w:tc>
-          <w:tcPr>
-            <w:tcW w:type="dxa" w:w="3600"/>
-            <w:shd w:fill="FFFFFF"/>
-            <w:tcMar>
-              <w:top w:w="100" w:type="dxa"/>
-              <w:bottom w:w="100" w:type="dxa"/>
-              <w:left w:w="150" w:type="dxa"/>
-              <w:right w:w="150" w:type="dxa"/>
-            </w:tcMar>
-          </w:tcPr>
-          <w:p>
-            <w:r>
-              <w:rPr>
-                <w:rFonts w:ascii="Calibri" w:hAnsi="Calibri"/>
-                <w:color w:val="334155"/>
-                <w:sz w:val="19"/>
-              </w:rPr>
-              <w:t>OTP Generation Route</w:t>
-            </w:r>
-          </w:p>
-        </w:tc>
-        <w:tc>
-          <w:tcPr>
-            <w:tcW w:type="dxa" w:w="5760"/>
-            <w:shd w:fill="FFFFFF"/>
-            <w:tcMar>
-              <w:top w:w="100" w:type="dxa"/>
-              <w:bottom w:w="100" w:type="dxa"/>
-              <w:left w:w="150" w:type="dxa"/>
-              <w:right w:w="150" w:type="dxa"/>
-            </w:tcMar>
-          </w:tcPr>
-          <w:p>
-            <w:r>
-              <w:rPr>
-                <w:rFonts w:ascii="Calibri" w:hAnsi="Calibri"/>
-                <w:color w:val="334155"/>
-                <w:sz w:val="19"/>
-              </w:rPr>
-              <w:t>src/app/api/auth/otp/generate/route.ts</w:t>
-            </w:r>
-          </w:p>
-        </w:tc>
-      </w:tr>
-      <w:tr>
-        <w:tc>
-          <w:tcPr>
-            <w:tcW w:type="dxa" w:w="3600"/>
-            <w:shd w:fill="F8FAFC"/>
-            <w:tcMar>
-              <w:top w:w="100" w:type="dxa"/>
-              <w:bottom w:w="100" w:type="dxa"/>
-              <w:left w:w="150" w:type="dxa"/>
-              <w:right w:w="150" w:type="dxa"/>
-            </w:tcMar>
-          </w:tcPr>
-          <w:p>
-            <w:r>
-              <w:rPr>
-                <w:rFonts w:ascii="Calibri" w:hAnsi="Calibri"/>
-                <w:color w:val="334155"/>
-                <w:sz w:val="19"/>
-              </w:rPr>
-              <w:t>OTP Verification Route</w:t>
-            </w:r>
-          </w:p>
-        </w:tc>
-        <w:tc>
-          <w:tcPr>
-            <w:tcW w:type="dxa" w:w="5760"/>
-            <w:shd w:fill="F8FAFC"/>
-            <w:tcMar>
-              <w:top w:w="100" w:type="dxa"/>
-              <w:bottom w:w="100" w:type="dxa"/>
-              <w:left w:w="150" w:type="dxa"/>
-              <w:right w:w="150" w:type="dxa"/>
-            </w:tcMar>
-          </w:tcPr>
-          <w:p>
-            <w:r>
-              <w:rPr>
-                <w:rFonts w:ascii="Calibri" w:hAnsi="Calibri"/>
-                <w:color w:val="334155"/>
-                <w:sz w:val="19"/>
-              </w:rPr>
-              <w:t>src/app/api/auth/otp/verify/route.ts</w:t>
-            </w:r>
-          </w:p>
-        </w:tc>
-      </w:tr>
-      <w:tr>
-        <w:tc>
-          <w:tcPr>
-            <w:tcW w:type="dxa" w:w="3600"/>
-            <w:shd w:fill="FFFFFF"/>
-            <w:tcMar>
-              <w:top w:w="100" w:type="dxa"/>
-              <w:bottom w:w="100" w:type="dxa"/>
-              <w:left w:w="150" w:type="dxa"/>
-              <w:right w:w="150" w:type="dxa"/>
-            </w:tcMar>
-          </w:tcPr>
-          <w:p>
-            <w:r>
-              <w:rPr>
-                <w:rFonts w:ascii="Calibri" w:hAnsi="Calibri"/>
-                <w:color w:val="334155"/>
-                <w:sz w:val="19"/>
-              </w:rPr>
-              <w:t>Session Creation &amp; Invalidation</w:t>
-            </w:r>
-          </w:p>
-        </w:tc>
-        <w:tc>
-          <w:tcPr>
-            <w:tcW w:type="dxa" w:w="5760"/>
-            <w:shd w:fill="FFFFFF"/>
-            <w:tcMar>
-              <w:top w:w="100" w:type="dxa"/>
-              <w:bottom w:w="100" w:type="dxa"/>
-              <w:left w:w="150" w:type="dxa"/>
-              <w:right w:w="150" w:type="dxa"/>
-            </w:tcMar>
-          </w:tcPr>
-          <w:p>
-            <w:r>
-              <w:rPr>
-                <w:rFonts w:ascii="Calibri" w:hAnsi="Calibri"/>
-                <w:color w:val="334155"/>
-                <w:sz w:val="19"/>
-              </w:rPr>
-              <w:t>src/app/api/auth/session/route.ts</w:t>
-            </w:r>
-          </w:p>
-        </w:tc>
-      </w:tr>
-      <w:tr>
-        <w:tc>
-          <w:tcPr>
-            <w:tcW w:type="dxa" w:w="3600"/>
-            <w:shd w:fill="F8FAFC"/>
-            <w:tcMar>
-              <w:top w:w="100" w:type="dxa"/>
-              <w:bottom w:w="100" w:type="dxa"/>
-              <w:left w:w="150" w:type="dxa"/>
-              <w:right w:w="150" w:type="dxa"/>
-            </w:tcMar>
-          </w:tcPr>
-          <w:p>
-            <w:r>
-              <w:rPr>
-                <w:rFonts w:ascii="Calibri" w:hAnsi="Calibri"/>
-                <w:color w:val="334155"/>
-                <w:sz w:val="19"/>
-              </w:rPr>
-              <w:t>Sessions Management Route</w:t>
-            </w:r>
-          </w:p>
-        </w:tc>
-        <w:tc>
-          <w:tcPr>
-            <w:tcW w:type="dxa" w:w="5760"/>
-            <w:shd w:fill="F8FAFC"/>
-            <w:tcMar>
-              <w:top w:w="100" w:type="dxa"/>
-              <w:bottom w:w="100" w:type="dxa"/>
-              <w:left w:w="150" w:type="dxa"/>
-              <w:right w:w="150" w:type="dxa"/>
-            </w:tcMar>
-          </w:tcPr>
-          <w:p>
-            <w:r>
-              <w:rPr>
-                <w:rFonts w:ascii="Calibri" w:hAnsi="Calibri"/>
-                <w:color w:val="334155"/>
-                <w:sz w:val="19"/>
-              </w:rPr>
-              <w:t>src/app/api/auth/sessions/route.ts</w:t>
-            </w:r>
-          </w:p>
-        </w:tc>
-      </w:tr>
-      <w:tr>
-        <w:tc>
-          <w:tcPr>
-            <w:tcW w:type="dxa" w:w="3600"/>
-            <w:shd w:fill="FFFFFF"/>
-            <w:tcMar>
-              <w:top w:w="100" w:type="dxa"/>
-              <w:bottom w:w="100" w:type="dxa"/>
-              <w:left w:w="150" w:type="dxa"/>
-              <w:right w:w="150" w:type="dxa"/>
-            </w:tcMar>
-          </w:tcPr>
-          <w:p>
-            <w:r>
-              <w:rPr>
-                <w:rFonts w:ascii="Calibri" w:hAnsi="Calibri"/>
-                <w:color w:val="334155"/>
-                <w:sz w:val="19"/>
-              </w:rPr>
-              <w:t>Demo Data Cleanup Route</w:t>
-            </w:r>
-          </w:p>
-        </w:tc>
-        <w:tc>
-          <w:tcPr>
-            <w:tcW w:type="dxa" w:w="5760"/>
-            <w:shd w:fill="FFFFFF"/>
-            <w:tcMar>
-              <w:top w:w="100" w:type="dxa"/>
-              <w:bottom w:w="100" w:type="dxa"/>
-              <w:left w:w="150" w:type="dxa"/>
-              <w:right w:w="150" w:type="dxa"/>
-            </w:tcMar>
-          </w:tcPr>
-          <w:p>
-            <w:r>
-              <w:rPr>
-                <w:rFonts w:ascii="Calibri" w:hAnsi="Calibri"/>
-                <w:color w:val="334155"/>
-                <w:sz w:val="19"/>
-              </w:rPr>
-              <w:t>src/app/api/demo/cleanup/route.ts</w:t>
-            </w:r>
-          </w:p>
-        </w:tc>
-      </w:tr>
-      <w:tr>
-        <w:tc>
-          <w:tcPr>
-            <w:tcW w:type="dxa" w:w="3600"/>
-            <w:shd w:fill="F8FAFC"/>
-            <w:tcMar>
-              <w:top w:w="100" w:type="dxa"/>
-              <w:bottom w:w="100" w:type="dxa"/>
-              <w:left w:w="150" w:type="dxa"/>
-              <w:right w:w="150" w:type="dxa"/>
-            </w:tcMar>
-          </w:tcPr>
-          <w:p>
-            <w:r>
-              <w:rPr>
-                <w:rFonts w:ascii="Calibri" w:hAnsi="Calibri"/>
-                <w:color w:val="334155"/>
-                <w:sz w:val="19"/>
-              </w:rPr>
-              <w:t>Progress Log Documentation</w:t>
-            </w:r>
-          </w:p>
-        </w:tc>
-        <w:tc>
-          <w:tcPr>
-            <w:tcW w:type="dxa" w:w="5760"/>
-            <w:shd w:fill="F8FAFC"/>
-            <w:tcMar>
-              <w:top w:w="100" w:type="dxa"/>
-              <w:bottom w:w="100" w:type="dxa"/>
-              <w:left w:w="150" w:type="dxa"/>
-              <w:right w:w="150" w:type="dxa"/>
-            </w:tcMar>
-          </w:tcPr>
-          <w:p>
-            <w:r>
-              <w:rPr>
-                <w:rFonts w:ascii="Calibri" w:hAnsi="Calibri"/>
-                <w:color w:val="334155"/>
-                <w:sz w:val="19"/>
-              </w:rPr>
-              <w:t>progress.md</w:t>
-            </w:r>
-          </w:p>
-        </w:tc>
-      </w:tr>
-    </w:tbl>
-    <w:p>
-      <w:pPr>
-        <w:spacing w:after="240"/>
-      </w:pPr>
     </w:p>
     <w:sectPr>
       <w:pgSz w:w="12240" w:h="15840"/>
@@ -3834,6 +798,11 @@
     <w:name w:val="Normal"/>
     <w:qFormat/>
     <w:rsid w:val="00FC693F"/>
+    <w:rPr>
+      <w:rFonts w:ascii="Calibri" w:hAnsi="Calibri"/>
+      <w:color w:val="2D3748"/>
+      <w:sz w:val="22"/>
+    </w:rPr>
   </w:style>
   <w:style w:type="paragraph" w:styleId="Header">
     <w:name w:val="header"/>
@@ -3897,7 +866,7 @@
       <w:rFonts w:asciiTheme="majorHAnsi" w:eastAsiaTheme="majorEastAsia" w:hAnsiTheme="majorHAnsi" w:cstheme="majorBidi"/>
       <w:b/>
       <w:bCs/>
-      <w:color w:val="365F91" w:themeColor="accent1" w:themeShade="BF"/>
+      <w:color w:val="1A312C"/>
       <w:sz w:val="28"/>
       <w:szCs w:val="28"/>
     </w:rPr>

</xml_diff>